<commit_message>
docs(boot): QNSC_BOOT_SPEC V3.2 from the mentor review of V3.1
Frame without ENTRY and LOAD_ADDR (Table 6-1), LENGTH 132 to 61 440,
FUAR removed and how a UART error is caught instead (section 5).
Figure 4-1 follows the owner's redraw: two SCRC steps, the DBG_EN pin,
no CRC decision; Table 4-2 rewritten with it. Figure 7-1 without the
UART error checks; its "no" labels no longer cut at the left edge.
DECISIONS gains section 1, V3.1 to V3.2. docx built with make docs.

Co-Authored-By: Claude Opus 5.5 (1M context) <noreply@anthropic.com>
</commit_message>
<xml_diff>
--- a/doc/specs/docx/QNSC_BOOT_SPEC.docx
+++ b/doc/specs/docx/QNSC_BOOT_SPEC.docx
@@ -39,7 +39,7 @@
         <w:t xml:space="preserve"> </w:t>
       </w:r>
       <w:r>
-        <w:t xml:space="preserve">V3.1</w:t>
+        <w:t xml:space="preserve">V3.2</w:t>
       </w:r>
     </w:p>
     <w:p>
@@ -425,6 +425,185 @@
               <w:jc w:val="left"/>
             </w:pPr>
             <w:r>
+              <w:t xml:space="preserve">V3.2</w:t>
+            </w:r>
+          </w:p>
+        </w:tc>
+        <w:tc>
+          <w:tcPr/>
+          <w:p>
+            <w:pPr>
+              <w:pStyle w:val="Compact"/>
+              <w:jc w:val="left"/>
+            </w:pPr>
+            <w:r>
+              <w:t xml:space="preserve">2026-10-09</w:t>
+            </w:r>
+          </w:p>
+        </w:tc>
+        <w:tc>
+          <w:tcPr/>
+          <w:p>
+            <w:pPr>
+              <w:pStyle w:val="Compact"/>
+              <w:jc w:val="left"/>
+            </w:pPr>
+            <w:r>
+              <w:t xml:space="preserve">Nguyen Hao Nam</w:t>
+            </w:r>
+          </w:p>
+        </w:tc>
+        <w:tc>
+          <w:tcPr/>
+          <w:p>
+            <w:pPr>
+              <w:pStyle w:val="Compact"/>
+              <w:jc w:val="left"/>
+            </w:pPr>
+            <w:r>
+              <w:t xml:space="preserve">–</w:t>
+            </w:r>
+          </w:p>
+        </w:tc>
+        <w:tc>
+          <w:tcPr/>
+          <w:p>
+            <w:pPr>
+              <w:pStyle w:val="Compact"/>
+              <w:jc w:val="left"/>
+            </w:pPr>
+            <w:r>
+              <w:t xml:space="preserve">Mentor review of V3.1 (Appendix B):</w:t>
+            </w:r>
+            <w:r>
+              <w:t xml:space="preserve"> </w:t>
+            </w:r>
+            <w:r>
+              <w:rPr>
+                <w:rStyle w:val="VerbatimChar"/>
+              </w:rPr>
+              <w:t xml:space="preserve">ENTRY</w:t>
+            </w:r>
+            <w:r>
+              <w:t xml:space="preserve"> </w:t>
+            </w:r>
+            <w:r>
+              <w:t xml:space="preserve">dropped from the header, for the same entry as debug boot;</w:t>
+            </w:r>
+            <w:r>
+              <w:t xml:space="preserve"> </w:t>
+            </w:r>
+            <w:r>
+              <w:rPr>
+                <w:rStyle w:val="VerbatimChar"/>
+              </w:rPr>
+              <w:t xml:space="preserve">LOAD_ADDR</w:t>
+            </w:r>
+            <w:r>
+              <w:t xml:space="preserve"> </w:t>
+            </w:r>
+            <w:r>
+              <w:t xml:space="preserve">dropped with it, so the payload always goes to</w:t>
+            </w:r>
+            <w:r>
+              <w:t xml:space="preserve"> </w:t>
+            </w:r>
+            <w:r>
+              <w:rPr>
+                <w:rStyle w:val="VerbatimChar"/>
+              </w:rPr>
+              <w:t xml:space="preserve">0x2000_1000</w:t>
+            </w:r>
+            <w:r>
+              <w:t xml:space="preserve"> </w:t>
+            </w:r>
+            <w:r>
+              <w:t xml:space="preserve">and the ROM jumps to</w:t>
+            </w:r>
+            <w:r>
+              <w:t xml:space="preserve"> </w:t>
+            </w:r>
+            <w:r>
+              <w:rPr>
+                <w:rStyle w:val="VerbatimChar"/>
+              </w:rPr>
+              <w:t xml:space="preserve">0x2000_1080</w:t>
+            </w:r>
+            <w:r>
+              <w:t xml:space="preserve">; header 12 bytes;</w:t>
+            </w:r>
+            <w:r>
+              <w:t xml:space="preserve"> </w:t>
+            </w:r>
+            <w:r>
+              <w:rPr>
+                <w:rStyle w:val="VerbatimChar"/>
+              </w:rPr>
+              <w:t xml:space="preserve">LENGTH</w:t>
+            </w:r>
+            <w:r>
+              <w:t xml:space="preserve"> </w:t>
+            </w:r>
+            <w:r>
+              <w:t xml:space="preserve">132 to 61 440;</w:t>
+            </w:r>
+            <w:r>
+              <w:t xml:space="preserve"> </w:t>
+            </w:r>
+            <w:r>
+              <w:rPr>
+                <w:rStyle w:val="VerbatimChar"/>
+              </w:rPr>
+              <w:t xml:space="preserve">FUAR</w:t>
+            </w:r>
+            <w:r>
+              <w:t xml:space="preserve"> </w:t>
+            </w:r>
+            <w:r>
+              <w:t xml:space="preserve">dropped and the UART error bits no longer read, since a CRC or the timeout catches every UART error; Figure 4-1 redrawn (two</w:t>
+            </w:r>
+            <w:r>
+              <w:t xml:space="preserve"> </w:t>
+            </w:r>
+            <w:r>
+              <w:rPr>
+                <w:rStyle w:val="VerbatimChar"/>
+              </w:rPr>
+              <w:t xml:space="preserve">SCRC</w:t>
+            </w:r>
+            <w:r>
+              <w:t xml:space="preserve"> </w:t>
+            </w:r>
+            <w:r>
+              <w:t xml:space="preserve">steps, the</w:t>
+            </w:r>
+            <w:r>
+              <w:t xml:space="preserve"> </w:t>
+            </w:r>
+            <w:r>
+              <w:rPr>
+                <w:rStyle w:val="VerbatimChar"/>
+              </w:rPr>
+              <w:t xml:space="preserve">DBG_EN</w:t>
+            </w:r>
+            <w:r>
+              <w:t xml:space="preserve"> </w:t>
+            </w:r>
+            <w:r>
+              <w:t xml:space="preserve">pin, no CRC test) and Table 4-2 with it</w:t>
+            </w:r>
+          </w:p>
+        </w:tc>
+      </w:tr>
+      <w:tr>
+        <w:tc>
+          <w:tcPr/>
+          <w:p>
+            <w:pPr>
+              <w:pStyle w:val="Compact"/>
+              <w:jc w:val="left"/>
+            </w:pPr>
+            <w:r>
               <w:t xml:space="preserve">V3.1</w:t>
             </w:r>
           </w:p>
@@ -849,7 +1028,7 @@
         <w:jc w:val="left"/>
       </w:pPr>
       <w:r>
-        <w:t xml:space="preserve">Frame: 20-byte header with its own CRC, payload, payload CRC – 6.</w:t>
+        <w:t xml:space="preserve">Frame: 12-byte header with its own CRC, payload, payload CRC – 6.</w:t>
       </w:r>
     </w:p>
     <w:p>
@@ -903,7 +1082,7 @@
         <w:jc w:val="left"/>
       </w:pPr>
       <w:r>
-        <w:t xml:space="preserve">Application up to 60 KiB, from</w:t>
+        <w:t xml:space="preserve">Application up to 60 KiB, loaded at</w:t>
       </w:r>
       <w:r>
         <w:t xml:space="preserve"> </w:t>
@@ -918,7 +1097,25 @@
         <w:t xml:space="preserve"> </w:t>
       </w:r>
       <w:r>
-        <w:t xml:space="preserve">– 9.</w:t>
+        <w:t xml:space="preserve">and entered at</w:t>
+      </w:r>
+      <w:r>
+        <w:t xml:space="preserve"> </w:t>
+      </w:r>
+      <w:r>
+        <w:rPr>
+          <w:rStyle w:val="VerbatimChar"/>
+        </w:rPr>
+        <w:t xml:space="preserve">0x2000_1080</w:t>
+      </w:r>
+      <w:r>
+        <w:t xml:space="preserve">,</w:t>
+      </w:r>
+      <w:r>
+        <w:t xml:space="preserve"> </w:t>
+      </w:r>
+      <w:r>
+        <w:t xml:space="preserve">the same as in debug boot – 9.</w:t>
       </w:r>
     </w:p>
     <w:bookmarkEnd w:id="23"/>
@@ -1573,7 +1770,7 @@
       <w:r>
         <w:drawing>
           <wp:inline>
-            <wp:extent cx="5727700" cy="4341791"/>
+            <wp:extent cx="5727700" cy="4233517"/>
             <wp:effectExtent b="0" l="0" r="0" t="0"/>
             <wp:docPr descr="Reset to application" title="" id="29" name="Picture"/>
             <a:graphic>
@@ -1594,7 +1791,7 @@
                   <pic:spPr bwMode="auto">
                     <a:xfrm>
                       <a:off x="0" y="0"/>
-                      <a:ext cx="5727700" cy="4341791"/>
+                      <a:ext cx="5727700" cy="4233517"/>
                     </a:xfrm>
                     <a:prstGeom prst="rect">
                       <a:avLst/>
@@ -2121,7 +2318,7 @@
               <w:rPr>
                 <w:rStyle w:val="VerbatimChar"/>
               </w:rPr>
-              <w:t xml:space="preserve">ENTRY</w:t>
+              <w:t xml:space="preserve">0x2000_1080</w:t>
             </w:r>
           </w:p>
         </w:tc>
@@ -2386,19 +2583,19 @@
               <w:jc w:val="left"/>
             </w:pPr>
             <w:r>
-              <w:t xml:space="preserve">Reset: POR, WDT bite or SW_RST</w:t>
-            </w:r>
-          </w:p>
-        </w:tc>
-        <w:tc>
-          <w:tcPr/>
-          <w:p>
-            <w:pPr>
-              <w:pStyle w:val="Compact"/>
-              <w:jc w:val="left"/>
-            </w:pPr>
-            <w:r>
-              <w:t xml:space="preserve">Any of the three resets the chip. Only POR makes</w:t>
+              <w:t xml:space="preserve">Power on</w:t>
+            </w:r>
+          </w:p>
+        </w:tc>
+        <w:tc>
+          <w:tcPr/>
+          <w:p>
+            <w:pPr>
+              <w:pStyle w:val="Compact"/>
+              <w:jc w:val="left"/>
+            </w:pPr>
+            <w:r>
+              <w:t xml:space="preserve">The power-on reset. A WDT bite or SW_RST resets the chip too and enters at the next step; only POR makes</w:t>
             </w:r>
             <w:r>
               <w:t xml:space="preserve"> </w:t>
@@ -2448,7 +2645,7 @@
               <w:jc w:val="left"/>
             </w:pPr>
             <w:r>
-              <w:t xml:space="preserve">SCRC: chip reset, then power-up</w:t>
+              <w:t xml:space="preserve">SCRC: hold the whole chip in reset, clock the IPs</w:t>
             </w:r>
           </w:p>
         </w:tc>
@@ -2490,7 +2687,7 @@
               <w:t xml:space="preserve"> </w:t>
             </w:r>
             <w:r>
-              <w:t xml:space="preserve">runs the CRM program, in this order: (1) starts the clocks of the peripherals that</w:t>
+              <w:t xml:space="preserve">runs the CRM program, which first starts the clocks of the peripherals that</w:t>
             </w:r>
             <w:r>
               <w:t xml:space="preserve"> </w:t>
@@ -2505,22 +2702,7 @@
               <w:t xml:space="preserve"> </w:t>
             </w:r>
             <w:r>
-              <w:t xml:space="preserve">asks for, after reset every peripheral except TIMER1; (2) at least 3 cycles later, releases the reset of every domain except the CPU; (3) at least 16 cycles later, opens the APB guards of the peripherals whose clock runs, the TIMER1 guard staying closed; (4) last, releases the CPU reset. Register values:</w:t>
-            </w:r>
-            <w:r>
-              <w:t xml:space="preserve"> </w:t>
-            </w:r>
-            <w:r>
-              <w:rPr>
-                <w:rStyle w:val="VerbatimChar"/>
-              </w:rPr>
-              <w:t xml:space="preserve">QNSC_SCRC_MAS</w:t>
-            </w:r>
-            <w:r>
-              <w:t xml:space="preserve"> </w:t>
-            </w:r>
-            <w:r>
-              <w:t xml:space="preserve">7.5.</w:t>
+              <w:t xml:space="preserve">asks for: after reset, every peripheral except TIMER1.</w:t>
             </w:r>
           </w:p>
         </w:tc>
@@ -2555,55 +2737,85 @@
               <w:jc w:val="left"/>
             </w:pPr>
             <w:r>
-              <w:t xml:space="preserve">DBG_EN captured = 1?</w:t>
-            </w:r>
-          </w:p>
-        </w:tc>
-        <w:tc>
-          <w:tcPr/>
-          <w:p>
-            <w:pPr>
-              <w:pStyle w:val="Compact"/>
-              <w:jc w:val="left"/>
-            </w:pPr>
-            <w:r>
-              <w:t xml:space="preserve">Decided by hardware, not by the ROM.</w:t>
-            </w:r>
-            <w:r>
-              <w:t xml:space="preserve"> </w:t>
-            </w:r>
-            <w:r>
-              <w:rPr>
-                <w:rStyle w:val="VerbatimChar"/>
-              </w:rPr>
-              <w:t xml:space="preserve">SYSDBG</w:t>
-            </w:r>
-            <w:r>
-              <w:t xml:space="preserve"> </w:t>
-            </w:r>
-            <w:r>
-              <w:t xml:space="preserve">reads the DBG_EN pin once after power-on. The value decides whether the CPU starts in the ROM (0) or in ISRAM (1), and whether the debugger may hold the CPU in reset. A WDT bite or SW_RST does not read the pin again.</w:t>
-            </w:r>
-          </w:p>
-        </w:tc>
-        <w:tc>
-          <w:tcPr/>
-          <w:p>
-            <w:pPr>
-              <w:pStyle w:val="Compact"/>
-              <w:jc w:val="left"/>
-            </w:pPr>
-            <w:r>
-              <w:rPr>
-                <w:rStyle w:val="VerbatimChar"/>
-              </w:rPr>
-              <w:t xml:space="preserve">QNSC_SYSDBG_MAS</w:t>
-            </w:r>
-            <w:r>
-              <w:t xml:space="preserve"> </w:t>
-            </w:r>
-            <w:r>
-              <w:t xml:space="preserve">7.1</w:t>
+              <w:t xml:space="preserve">SCRC: release the reset of every IP except the CPU</w:t>
+            </w:r>
+          </w:p>
+        </w:tc>
+        <w:tc>
+          <w:tcPr/>
+          <w:p>
+            <w:pPr>
+              <w:pStyle w:val="Compact"/>
+              <w:jc w:val="left"/>
+            </w:pPr>
+            <w:r>
+              <w:t xml:space="preserve">At least 3 cycles later</w:t>
+            </w:r>
+            <w:r>
+              <w:t xml:space="preserve"> </w:t>
+            </w:r>
+            <w:r>
+              <w:rPr>
+                <w:rStyle w:val="VerbatimChar"/>
+              </w:rPr>
+              <w:t xml:space="preserve">MCPU</w:t>
+            </w:r>
+            <w:r>
+              <w:t xml:space="preserve"> </w:t>
+            </w:r>
+            <w:r>
+              <w:t xml:space="preserve">releases the reset of every domain except the CPU. At least 16 cycles after that it opens the APB guards of the peripherals whose clock runs, the TIMER1 guard staying closed, so</w:t>
+            </w:r>
+            <w:r>
+              <w:t xml:space="preserve"> </w:t>
+            </w:r>
+            <w:r>
+              <w:rPr>
+                <w:rStyle w:val="VerbatimChar"/>
+              </w:rPr>
+              <w:t xml:space="preserve">UART0</w:t>
+            </w:r>
+            <w:r>
+              <w:t xml:space="preserve"> </w:t>
+            </w:r>
+            <w:r>
+              <w:t xml:space="preserve">is reachable before the CPU runs. Register values:</w:t>
+            </w:r>
+            <w:r>
+              <w:t xml:space="preserve"> </w:t>
+            </w:r>
+            <w:r>
+              <w:rPr>
+                <w:rStyle w:val="VerbatimChar"/>
+              </w:rPr>
+              <w:t xml:space="preserve">QNSC_SCRC_MAS</w:t>
+            </w:r>
+            <w:r>
+              <w:t xml:space="preserve"> </w:t>
+            </w:r>
+            <w:r>
+              <w:t xml:space="preserve">7.5.</w:t>
+            </w:r>
+          </w:p>
+        </w:tc>
+        <w:tc>
+          <w:tcPr/>
+          <w:p>
+            <w:pPr>
+              <w:pStyle w:val="Compact"/>
+              <w:jc w:val="left"/>
+            </w:pPr>
+            <w:r>
+              <w:rPr>
+                <w:rStyle w:val="VerbatimChar"/>
+              </w:rPr>
+              <w:t xml:space="preserve">QNSC_SCRC_MAS</w:t>
+            </w:r>
+            <w:r>
+              <w:t xml:space="preserve"> </w:t>
+            </w:r>
+            <w:r>
+              <w:t xml:space="preserve">7.5</w:t>
             </w:r>
           </w:p>
         </w:tc>
@@ -2617,34 +2829,19 @@
               <w:jc w:val="left"/>
             </w:pPr>
             <w:r>
-              <w:t xml:space="preserve">SCRC release CPU (DBG_EN = 0)</w:t>
-            </w:r>
-          </w:p>
-        </w:tc>
-        <w:tc>
-          <w:tcPr/>
-          <w:p>
-            <w:pPr>
-              <w:pStyle w:val="Compact"/>
-              <w:jc w:val="left"/>
-            </w:pPr>
-            <w:r>
-              <w:t xml:space="preserve">The CPU leaves reset only when</w:t>
-            </w:r>
-            <w:r>
-              <w:t xml:space="preserve"> </w:t>
-            </w:r>
-            <w:r>
-              <w:rPr>
-                <w:rStyle w:val="VerbatimChar"/>
-              </w:rPr>
-              <w:t xml:space="preserve">SCRC</w:t>
-            </w:r>
-            <w:r>
-              <w:t xml:space="preserve"> </w:t>
-            </w:r>
-            <w:r>
-              <w:t xml:space="preserve">has released it and</w:t>
+              <w:t xml:space="preserve">DBG_EN pin = 1?</w:t>
+            </w:r>
+          </w:p>
+        </w:tc>
+        <w:tc>
+          <w:tcPr/>
+          <w:p>
+            <w:pPr>
+              <w:pStyle w:val="Compact"/>
+              <w:jc w:val="left"/>
+            </w:pPr>
+            <w:r>
+              <w:t xml:space="preserve">Decided by hardware, not by the ROM.</w:t>
             </w:r>
             <w:r>
               <w:t xml:space="preserve"> </w:t>
@@ -2659,89 +2856,17 @@
               <w:t xml:space="preserve"> </w:t>
             </w:r>
             <w:r>
-              <w:t xml:space="preserve">no longer holds it. With</w:t>
-            </w:r>
-            <w:r>
-              <w:t xml:space="preserve"> </w:t>
-            </w:r>
-            <w:r>
-              <w:rPr>
-                <w:rStyle w:val="VerbatimChar"/>
-              </w:rPr>
-              <w:t xml:space="preserve">DBG_EN</w:t>
-            </w:r>
-            <w:r>
-              <w:t xml:space="preserve"> </w:t>
-            </w:r>
-            <w:r>
-              <w:t xml:space="preserve">= 0,</w:t>
-            </w:r>
-            <w:r>
-              <w:t xml:space="preserve"> </w:t>
-            </w:r>
-            <w:r>
-              <w:rPr>
-                <w:rStyle w:val="VerbatimChar"/>
-              </w:rPr>
-              <w:t xml:space="preserve">SYSDBG</w:t>
-            </w:r>
-            <w:r>
-              <w:t xml:space="preserve"> </w:t>
-            </w:r>
-            <w:r>
-              <w:t xml:space="preserve">lets go as soon as it has captured</w:t>
-            </w:r>
-            <w:r>
-              <w:t xml:space="preserve"> </w:t>
-            </w:r>
-            <w:r>
-              <w:rPr>
-                <w:rStyle w:val="VerbatimChar"/>
-              </w:rPr>
-              <w:t xml:space="preserve">DBG_EN</w:t>
-            </w:r>
-            <w:r>
-              <w:t xml:space="preserve">, so the CPU starts when</w:t>
-            </w:r>
-            <w:r>
-              <w:t xml:space="preserve"> </w:t>
-            </w:r>
-            <w:r>
-              <w:rPr>
-                <w:rStyle w:val="VerbatimChar"/>
-              </w:rPr>
-              <w:t xml:space="preserve">SCRC</w:t>
-            </w:r>
-            <w:r>
-              <w:t xml:space="preserve"> </w:t>
-            </w:r>
-            <w:r>
-              <w:t xml:space="preserve">releases it, with the boot address already pointing at the ROM.</w:t>
-            </w:r>
-          </w:p>
-        </w:tc>
-        <w:tc>
-          <w:tcPr/>
-          <w:p>
-            <w:pPr>
-              <w:pStyle w:val="Compact"/>
-              <w:jc w:val="left"/>
-            </w:pPr>
-            <w:r>
-              <w:rPr>
-                <w:rStyle w:val="VerbatimChar"/>
-              </w:rPr>
-              <w:t xml:space="preserve">QNSC_SCRC_MAS</w:t>
-            </w:r>
-            <w:r>
-              <w:t xml:space="preserve"> </w:t>
-            </w:r>
-            <w:r>
-              <w:t xml:space="preserve">7.8,</w:t>
-            </w:r>
-            <w:r>
-              <w:t xml:space="preserve"> </w:t>
-            </w:r>
+              <w:t xml:space="preserve">reads the DBG_EN pin once after power-on. The value decides whether the CPU starts in the ROM (0) or in ISRAM (1), and whether the debugger may hold the CPU in reset. A WDT bite or SW_RST does not read the pin again.</w:t>
+            </w:r>
+          </w:p>
+        </w:tc>
+        <w:tc>
+          <w:tcPr/>
+          <w:p>
+            <w:pPr>
+              <w:pStyle w:val="Compact"/>
+              <w:jc w:val="left"/>
+            </w:pPr>
             <w:r>
               <w:rPr>
                 <w:rStyle w:val="VerbatimChar"/>
@@ -2766,79 +2891,157 @@
               <w:jc w:val="left"/>
             </w:pPr>
             <w:r>
-              <w:t xml:space="preserve">Ibex fetches 0x0000_0080 (ROM)</w:t>
-            </w:r>
-          </w:p>
-        </w:tc>
-        <w:tc>
-          <w:tcPr/>
-          <w:p>
-            <w:pPr>
-              <w:pStyle w:val="Compact"/>
-              <w:jc w:val="left"/>
-            </w:pPr>
-            <w:r>
-              <w:t xml:space="preserve">Ibex starts at its boot address + 0x80:</w:t>
-            </w:r>
-            <w:r>
-              <w:t xml:space="preserve"> </w:t>
-            </w:r>
-            <w:r>
-              <w:rPr>
-                <w:rStyle w:val="VerbatimChar"/>
-              </w:rPr>
-              <w:t xml:space="preserve">0x0000_0080</w:t>
-            </w:r>
-            <w:r>
-              <w:t xml:space="preserve"> </w:t>
-            </w:r>
-            <w:r>
-              <w:t xml:space="preserve">in the ROM. The start-up code points the stack at the top of DSRAM,</w:t>
-            </w:r>
-            <w:r>
-              <w:t xml:space="preserve"> </w:t>
-            </w:r>
-            <w:r>
-              <w:rPr>
-                <w:rStyle w:val="VerbatimChar"/>
-              </w:rPr>
-              <w:t xml:space="preserve">0x3000_8000</w:t>
-            </w:r>
-            <w:r>
-              <w:t xml:space="preserve">, and calls the bootloader,</w:t>
-            </w:r>
-            <w:r>
-              <w:t xml:space="preserve"> </w:t>
-            </w:r>
-            <w:r>
-              <w:rPr>
-                <w:rStyle w:val="VerbatimChar"/>
-              </w:rPr>
-              <w:t xml:space="preserve">boot_main</w:t>
-            </w:r>
-            <w:r>
-              <w:t xml:space="preserve">.</w:t>
-            </w:r>
-          </w:p>
-        </w:tc>
-        <w:tc>
-          <w:tcPr/>
-          <w:p>
-            <w:pPr>
-              <w:pStyle w:val="Compact"/>
-              <w:jc w:val="left"/>
-            </w:pPr>
-            <w:r>
-              <w:rPr>
-                <w:rStyle w:val="VerbatimChar"/>
-              </w:rPr>
-              <w:t xml:space="preserve">QNSC_ROM_MAS</w:t>
-            </w:r>
-            <w:r>
-              <w:t xml:space="preserve"> </w:t>
-            </w:r>
-            <w:r>
-              <w:t xml:space="preserve">6, section 8</w:t>
+              <w:t xml:space="preserve">SCRC releases the CPU reset (DBG_EN = 0)</w:t>
+            </w:r>
+          </w:p>
+        </w:tc>
+        <w:tc>
+          <w:tcPr/>
+          <w:p>
+            <w:pPr>
+              <w:pStyle w:val="Compact"/>
+              <w:jc w:val="left"/>
+            </w:pPr>
+            <w:r>
+              <w:t xml:space="preserve">Last,</w:t>
+            </w:r>
+            <w:r>
+              <w:t xml:space="preserve"> </w:t>
+            </w:r>
+            <w:r>
+              <w:rPr>
+                <w:rStyle w:val="VerbatimChar"/>
+              </w:rPr>
+              <w:t xml:space="preserve">MCPU</w:t>
+            </w:r>
+            <w:r>
+              <w:t xml:space="preserve"> </w:t>
+            </w:r>
+            <w:r>
+              <w:t xml:space="preserve">releases the CPU reset. The CPU leaves reset only when</w:t>
+            </w:r>
+            <w:r>
+              <w:t xml:space="preserve"> </w:t>
+            </w:r>
+            <w:r>
+              <w:rPr>
+                <w:rStyle w:val="VerbatimChar"/>
+              </w:rPr>
+              <w:t xml:space="preserve">SCRC</w:t>
+            </w:r>
+            <w:r>
+              <w:t xml:space="preserve"> </w:t>
+            </w:r>
+            <w:r>
+              <w:t xml:space="preserve">has released it and</w:t>
+            </w:r>
+            <w:r>
+              <w:t xml:space="preserve"> </w:t>
+            </w:r>
+            <w:r>
+              <w:rPr>
+                <w:rStyle w:val="VerbatimChar"/>
+              </w:rPr>
+              <w:t xml:space="preserve">SYSDBG</w:t>
+            </w:r>
+            <w:r>
+              <w:t xml:space="preserve"> </w:t>
+            </w:r>
+            <w:r>
+              <w:t xml:space="preserve">no longer holds it. With</w:t>
+            </w:r>
+            <w:r>
+              <w:t xml:space="preserve"> </w:t>
+            </w:r>
+            <w:r>
+              <w:rPr>
+                <w:rStyle w:val="VerbatimChar"/>
+              </w:rPr>
+              <w:t xml:space="preserve">DBG_EN</w:t>
+            </w:r>
+            <w:r>
+              <w:t xml:space="preserve"> </w:t>
+            </w:r>
+            <w:r>
+              <w:t xml:space="preserve">= 0,</w:t>
+            </w:r>
+            <w:r>
+              <w:t xml:space="preserve"> </w:t>
+            </w:r>
+            <w:r>
+              <w:rPr>
+                <w:rStyle w:val="VerbatimChar"/>
+              </w:rPr>
+              <w:t xml:space="preserve">SYSDBG</w:t>
+            </w:r>
+            <w:r>
+              <w:t xml:space="preserve"> </w:t>
+            </w:r>
+            <w:r>
+              <w:t xml:space="preserve">lets go as soon as it has captured</w:t>
+            </w:r>
+            <w:r>
+              <w:t xml:space="preserve"> </w:t>
+            </w:r>
+            <w:r>
+              <w:rPr>
+                <w:rStyle w:val="VerbatimChar"/>
+              </w:rPr>
+              <w:t xml:space="preserve">DBG_EN</w:t>
+            </w:r>
+            <w:r>
+              <w:t xml:space="preserve">, so the CPU starts when</w:t>
+            </w:r>
+            <w:r>
+              <w:t xml:space="preserve"> </w:t>
+            </w:r>
+            <w:r>
+              <w:rPr>
+                <w:rStyle w:val="VerbatimChar"/>
+              </w:rPr>
+              <w:t xml:space="preserve">SCRC</w:t>
+            </w:r>
+            <w:r>
+              <w:t xml:space="preserve"> </w:t>
+            </w:r>
+            <w:r>
+              <w:t xml:space="preserve">releases it, with the boot address already pointing at the ROM.</w:t>
+            </w:r>
+          </w:p>
+        </w:tc>
+        <w:tc>
+          <w:tcPr/>
+          <w:p>
+            <w:pPr>
+              <w:pStyle w:val="Compact"/>
+              <w:jc w:val="left"/>
+            </w:pPr>
+            <w:r>
+              <w:rPr>
+                <w:rStyle w:val="VerbatimChar"/>
+              </w:rPr>
+              <w:t xml:space="preserve">QNSC_SCRC_MAS</w:t>
+            </w:r>
+            <w:r>
+              <w:t xml:space="preserve"> </w:t>
+            </w:r>
+            <w:r>
+              <w:t xml:space="preserve">7.5, 7.8,</w:t>
+            </w:r>
+            <w:r>
+              <w:t xml:space="preserve"> </w:t>
+            </w:r>
+            <w:r>
+              <w:rPr>
+                <w:rStyle w:val="VerbatimChar"/>
+              </w:rPr>
+              <w:t xml:space="preserve">QNSC_SYSDBG_MAS</w:t>
+            </w:r>
+            <w:r>
+              <w:t xml:space="preserve"> </w:t>
+            </w:r>
+            <w:r>
+              <w:t xml:space="preserve">7.1</w:t>
             </w:r>
           </w:p>
         </w:tc>
@@ -2852,31 +3055,79 @@
               <w:jc w:val="left"/>
             </w:pPr>
             <w:r>
-              <w:t xml:space="preserve">init UART0</w:t>
-            </w:r>
-          </w:p>
-        </w:tc>
-        <w:tc>
-          <w:tcPr/>
-          <w:p>
-            <w:pPr>
-              <w:pStyle w:val="Compact"/>
-              <w:jc w:val="left"/>
-            </w:pPr>
-            <w:r>
-              <w:t xml:space="preserve">Sets 19 200 baud, 8 data bits, no parity and 1 stop bit, turns the FIFOs on and the interrupts off (section 5). The ROM starts listening for MAGIC at once.</w:t>
-            </w:r>
-          </w:p>
-        </w:tc>
-        <w:tc>
-          <w:tcPr/>
-          <w:p>
-            <w:pPr>
-              <w:pStyle w:val="Compact"/>
-              <w:jc w:val="left"/>
-            </w:pPr>
-            <w:r>
-              <w:t xml:space="preserve">5</w:t>
+              <w:t xml:space="preserve">Ibex fetches 0x0000_0080 (ROM)</w:t>
+            </w:r>
+          </w:p>
+        </w:tc>
+        <w:tc>
+          <w:tcPr/>
+          <w:p>
+            <w:pPr>
+              <w:pStyle w:val="Compact"/>
+              <w:jc w:val="left"/>
+            </w:pPr>
+            <w:r>
+              <w:t xml:space="preserve">Ibex starts at its boot address + 0x80:</w:t>
+            </w:r>
+            <w:r>
+              <w:t xml:space="preserve"> </w:t>
+            </w:r>
+            <w:r>
+              <w:rPr>
+                <w:rStyle w:val="VerbatimChar"/>
+              </w:rPr>
+              <w:t xml:space="preserve">0x0000_0080</w:t>
+            </w:r>
+            <w:r>
+              <w:t xml:space="preserve"> </w:t>
+            </w:r>
+            <w:r>
+              <w:t xml:space="preserve">in the ROM. The start-up code points the stack at the top of DSRAM,</w:t>
+            </w:r>
+            <w:r>
+              <w:t xml:space="preserve"> </w:t>
+            </w:r>
+            <w:r>
+              <w:rPr>
+                <w:rStyle w:val="VerbatimChar"/>
+              </w:rPr>
+              <w:t xml:space="preserve">0x3000_8000</w:t>
+            </w:r>
+            <w:r>
+              <w:t xml:space="preserve">, and calls the bootloader,</w:t>
+            </w:r>
+            <w:r>
+              <w:t xml:space="preserve"> </w:t>
+            </w:r>
+            <w:r>
+              <w:rPr>
+                <w:rStyle w:val="VerbatimChar"/>
+              </w:rPr>
+              <w:t xml:space="preserve">boot_main</w:t>
+            </w:r>
+            <w:r>
+              <w:t xml:space="preserve">.</w:t>
+            </w:r>
+          </w:p>
+        </w:tc>
+        <w:tc>
+          <w:tcPr/>
+          <w:p>
+            <w:pPr>
+              <w:pStyle w:val="Compact"/>
+              <w:jc w:val="left"/>
+            </w:pPr>
+            <w:r>
+              <w:rPr>
+                <w:rStyle w:val="VerbatimChar"/>
+              </w:rPr>
+              <w:t xml:space="preserve">QNSC_ROM_MAS</w:t>
+            </w:r>
+            <w:r>
+              <w:t xml:space="preserve"> </w:t>
+            </w:r>
+            <w:r>
+              <w:t xml:space="preserve">6, section 8</w:t>
             </w:r>
           </w:p>
         </w:tc>
@@ -2890,31 +3141,31 @@
               <w:jc w:val="left"/>
             </w:pPr>
             <w:r>
-              <w:t xml:space="preserve">download frame to ISRAM</w:t>
-            </w:r>
-          </w:p>
-        </w:tc>
-        <w:tc>
-          <w:tcPr/>
-          <w:p>
-            <w:pPr>
-              <w:pStyle w:val="Compact"/>
-              <w:jc w:val="left"/>
-            </w:pPr>
-            <w:r>
-              <w:t xml:space="preserve">Receive and check the frame, Figure 7-1 and Table 7-1.</w:t>
-            </w:r>
-          </w:p>
-        </w:tc>
-        <w:tc>
-          <w:tcPr/>
-          <w:p>
-            <w:pPr>
-              <w:pStyle w:val="Compact"/>
-              <w:jc w:val="left"/>
-            </w:pPr>
-            <w:r>
-              <w:t xml:space="preserve">7</w:t>
+              <w:t xml:space="preserve">init UART0</w:t>
+            </w:r>
+          </w:p>
+        </w:tc>
+        <w:tc>
+          <w:tcPr/>
+          <w:p>
+            <w:pPr>
+              <w:pStyle w:val="Compact"/>
+              <w:jc w:val="left"/>
+            </w:pPr>
+            <w:r>
+              <w:t xml:space="preserve">Sets 19 200 baud, 8 data bits, no parity and 1 stop bit, turns the FIFOs on and the interrupts off (section 5). The ROM starts listening for MAGIC at once.</w:t>
+            </w:r>
+          </w:p>
+        </w:tc>
+        <w:tc>
+          <w:tcPr/>
+          <w:p>
+            <w:pPr>
+              <w:pStyle w:val="Compact"/>
+              <w:jc w:val="left"/>
+            </w:pPr>
+            <w:r>
+              <w:t xml:space="preserve">5</w:t>
             </w:r>
           </w:p>
         </w:tc>
@@ -2928,31 +3179,58 @@
               <w:jc w:val="left"/>
             </w:pPr>
             <w:r>
-              <w:t xml:space="preserve">CRC pass?</w:t>
-            </w:r>
-          </w:p>
-        </w:tc>
-        <w:tc>
-          <w:tcPr/>
-          <w:p>
-            <w:pPr>
-              <w:pStyle w:val="Compact"/>
-              <w:jc w:val="left"/>
-            </w:pPr>
-            <w:r>
-              <w:t xml:space="preserve">Yes when both CRCs match, the header CRC and the payload CRC, and every other check of Figure 7-1 passes. If not: the ROM sends a failure token, empties the line and sends QRDY; the PC resends the whole frame.</w:t>
-            </w:r>
-          </w:p>
-        </w:tc>
-        <w:tc>
-          <w:tcPr/>
-          <w:p>
-            <w:pPr>
-              <w:pStyle w:val="Compact"/>
-              <w:jc w:val="left"/>
-            </w:pPr>
-            <w:r>
-              <w:t xml:space="preserve">7.2</w:t>
+              <w:t xml:space="preserve">receive the frame from the PC over UART0 and write it to 0x2000_1000 (ISRAM)</w:t>
+            </w:r>
+          </w:p>
+        </w:tc>
+        <w:tc>
+          <w:tcPr/>
+          <w:p>
+            <w:pPr>
+              <w:pStyle w:val="Compact"/>
+              <w:jc w:val="left"/>
+            </w:pPr>
+            <w:r>
+              <w:t xml:space="preserve">Receive and check the frame, Figure 7-1 and Table 7-1. The step ends when the header CRC,</w:t>
+            </w:r>
+            <w:r>
+              <w:t xml:space="preserve"> </w:t>
+            </w:r>
+            <w:r>
+              <w:rPr>
+                <w:rStyle w:val="VerbatimChar"/>
+              </w:rPr>
+              <w:t xml:space="preserve">LENGTH</w:t>
+            </w:r>
+            <w:r>
+              <w:t xml:space="preserve"> </w:t>
+            </w:r>
+            <w:r>
+              <w:t xml:space="preserve">and the payload CRC all pass. On any failure the ROM sends a failure token, empties the line and sends</w:t>
+            </w:r>
+            <w:r>
+              <w:t xml:space="preserve"> </w:t>
+            </w:r>
+            <w:r>
+              <w:rPr>
+                <w:rStyle w:val="VerbatimChar"/>
+              </w:rPr>
+              <w:t xml:space="preserve">QRDY</w:t>
+            </w:r>
+            <w:r>
+              <w:t xml:space="preserve">, and the PC resends the whole frame.</w:t>
+            </w:r>
+          </w:p>
+        </w:tc>
+        <w:tc>
+          <w:tcPr/>
+          <w:p>
+            <w:pPr>
+              <w:pStyle w:val="Compact"/>
+              <w:jc w:val="left"/>
+            </w:pPr>
+            <w:r>
+              <w:t xml:space="preserve">7</w:t>
             </w:r>
           </w:p>
         </w:tc>
@@ -2966,19 +3244,55 @@
               <w:jc w:val="left"/>
             </w:pPr>
             <w:r>
-              <w:t xml:space="preserve">jump to ENTRY</w:t>
-            </w:r>
-          </w:p>
-        </w:tc>
-        <w:tc>
-          <w:tcPr/>
-          <w:p>
-            <w:pPr>
-              <w:pStyle w:val="Compact"/>
-              <w:jc w:val="left"/>
-            </w:pPr>
-            <w:r>
-              <w:t xml:space="preserve">The ROM sends ACKP, waits until the token has fully left UART0, clears the instruction prefetch and jumps to ENTRY.</w:t>
+              <w:t xml:space="preserve">jump to 0x2000_1080 (ISRAM)</w:t>
+            </w:r>
+          </w:p>
+        </w:tc>
+        <w:tc>
+          <w:tcPr/>
+          <w:p>
+            <w:pPr>
+              <w:pStyle w:val="Compact"/>
+              <w:jc w:val="left"/>
+            </w:pPr>
+            <w:r>
+              <w:t xml:space="preserve">The ROM sends</w:t>
+            </w:r>
+            <w:r>
+              <w:t xml:space="preserve"> </w:t>
+            </w:r>
+            <w:r>
+              <w:rPr>
+                <w:rStyle w:val="VerbatimChar"/>
+              </w:rPr>
+              <w:t xml:space="preserve">ACKP</w:t>
+            </w:r>
+            <w:r>
+              <w:t xml:space="preserve">, waits until the token has fully left</w:t>
+            </w:r>
+            <w:r>
+              <w:t xml:space="preserve"> </w:t>
+            </w:r>
+            <w:r>
+              <w:rPr>
+                <w:rStyle w:val="VerbatimChar"/>
+              </w:rPr>
+              <w:t xml:space="preserve">UART0</w:t>
+            </w:r>
+            <w:r>
+              <w:t xml:space="preserve">, clears the instruction prefetch and jumps to</w:t>
+            </w:r>
+            <w:r>
+              <w:t xml:space="preserve"> </w:t>
+            </w:r>
+            <w:r>
+              <w:rPr>
+                <w:rStyle w:val="VerbatimChar"/>
+              </w:rPr>
+              <w:t xml:space="preserve">0x2000_1080</w:t>
+            </w:r>
+            <w:r>
+              <w:t xml:space="preserve">, where Ibex starts in debug boot too.</w:t>
             </w:r>
           </w:p>
         </w:tc>
@@ -3004,64 +3318,31 @@
               <w:jc w:val="left"/>
             </w:pPr>
             <w:r>
-              <w:t xml:space="preserve">SYSDBG holds the CPU (DBG_EN = 1)</w:t>
-            </w:r>
-          </w:p>
-        </w:tc>
-        <w:tc>
-          <w:tcPr/>
-          <w:p>
-            <w:pPr>
-              <w:pStyle w:val="Compact"/>
-              <w:jc w:val="left"/>
-            </w:pPr>
-            <w:r>
-              <w:rPr>
-                <w:rStyle w:val="VerbatimChar"/>
-              </w:rPr>
-              <w:t xml:space="preserve">SYSDBG</w:t>
-            </w:r>
-            <w:r>
-              <w:t xml:space="preserve"> </w:t>
-            </w:r>
-            <w:r>
-              <w:t xml:space="preserve">keeps the CPU in reset while</w:t>
-            </w:r>
-            <w:r>
-              <w:t xml:space="preserve"> </w:t>
-            </w:r>
-            <w:r>
-              <w:rPr>
-                <w:rStyle w:val="VerbatimChar"/>
-              </w:rPr>
-              <w:t xml:space="preserve">SCRC</w:t>
-            </w:r>
-            <w:r>
-              <w:t xml:space="preserve"> </w:t>
-            </w:r>
-            <w:r>
-              <w:t xml:space="preserve">releases everything else. Meanwhile the host writes the debug program and the application image into ISRAM over JTAG.</w:t>
-            </w:r>
-          </w:p>
-        </w:tc>
-        <w:tc>
-          <w:tcPr/>
-          <w:p>
-            <w:pPr>
-              <w:pStyle w:val="Compact"/>
-              <w:jc w:val="left"/>
-            </w:pPr>
-            <w:r>
-              <w:rPr>
-                <w:rStyle w:val="VerbatimChar"/>
-              </w:rPr>
-              <w:t xml:space="preserve">QNSC_SYSDBG_MAS</w:t>
-            </w:r>
-            <w:r>
-              <w:t xml:space="preserve"> </w:t>
-            </w:r>
-            <w:r>
-              <w:t xml:space="preserve">7.2</w:t>
+              <w:t xml:space="preserve">application runs from ISRAM</w:t>
+            </w:r>
+          </w:p>
+        </w:tc>
+        <w:tc>
+          <w:tcPr/>
+          <w:p>
+            <w:pPr>
+              <w:pStyle w:val="Compact"/>
+              <w:jc w:val="left"/>
+            </w:pPr>
+            <w:r>
+              <w:t xml:space="preserve">Section 9.</w:t>
+            </w:r>
+          </w:p>
+        </w:tc>
+        <w:tc>
+          <w:tcPr/>
+          <w:p>
+            <w:pPr>
+              <w:pStyle w:val="Compact"/>
+              <w:jc w:val="left"/>
+            </w:pPr>
+            <w:r>
+              <w:t xml:space="preserve">9</w:t>
             </w:r>
           </w:p>
         </w:tc>
@@ -3075,7 +3356,129 @@
               <w:jc w:val="left"/>
             </w:pPr>
             <w:r>
-              <w:t xml:space="preserve">SYSDBG release CPU</w:t>
+              <w:t xml:space="preserve">SYSDBG holds the CPU in reset, the debug program is loaded to 0x2000_1000 (ISRAM) over JTAG (DBG_EN = 1)</w:t>
+            </w:r>
+          </w:p>
+        </w:tc>
+        <w:tc>
+          <w:tcPr/>
+          <w:p>
+            <w:pPr>
+              <w:pStyle w:val="Compact"/>
+              <w:jc w:val="left"/>
+            </w:pPr>
+            <w:r>
+              <w:rPr>
+                <w:rStyle w:val="VerbatimChar"/>
+              </w:rPr>
+              <w:t xml:space="preserve">CPUHOLD</w:t>
+            </w:r>
+            <w:r>
+              <w:t xml:space="preserve"> </w:t>
+            </w:r>
+            <w:r>
+              <w:t xml:space="preserve">is 1 after power-on, so</w:t>
+            </w:r>
+            <w:r>
+              <w:t xml:space="preserve"> </w:t>
+            </w:r>
+            <w:r>
+              <w:rPr>
+                <w:rStyle w:val="VerbatimChar"/>
+              </w:rPr>
+              <w:t xml:space="preserve">SYSDBG</w:t>
+            </w:r>
+            <w:r>
+              <w:t xml:space="preserve"> </w:t>
+            </w:r>
+            <w:r>
+              <w:t xml:space="preserve">keeps the CPU in reset while</w:t>
+            </w:r>
+            <w:r>
+              <w:t xml:space="preserve"> </w:t>
+            </w:r>
+            <w:r>
+              <w:rPr>
+                <w:rStyle w:val="VerbatimChar"/>
+              </w:rPr>
+              <w:t xml:space="preserve">SCRC</w:t>
+            </w:r>
+            <w:r>
+              <w:t xml:space="preserve"> </w:t>
+            </w:r>
+            <w:r>
+              <w:t xml:space="preserve">releases everything else, the CPU reset included. Meanwhile the host writes, over JTAG, the debug window</w:t>
+            </w:r>
+            <w:r>
+              <w:t xml:space="preserve"> </w:t>
+            </w:r>
+            <w:r>
+              <w:rPr>
+                <w:rStyle w:val="VerbatimChar"/>
+              </w:rPr>
+              <w:t xml:space="preserve">0x2000_0000</w:t>
+            </w:r>
+            <w:r>
+              <w:t xml:space="preserve">–</w:t>
+            </w:r>
+            <w:r>
+              <w:rPr>
+                <w:rStyle w:val="VerbatimChar"/>
+              </w:rPr>
+              <w:t xml:space="preserve">0x2000_0FFF</w:t>
+            </w:r>
+            <w:r>
+              <w:t xml:space="preserve"> </w:t>
+            </w:r>
+            <w:r>
+              <w:t xml:space="preserve">and the program image from</w:t>
+            </w:r>
+            <w:r>
+              <w:t xml:space="preserve"> </w:t>
+            </w:r>
+            <w:r>
+              <w:rPr>
+                <w:rStyle w:val="VerbatimChar"/>
+              </w:rPr>
+              <w:t xml:space="preserve">0x2000_1000</w:t>
+            </w:r>
+            <w:r>
+              <w:t xml:space="preserve">.</w:t>
+            </w:r>
+          </w:p>
+        </w:tc>
+        <w:tc>
+          <w:tcPr/>
+          <w:p>
+            <w:pPr>
+              <w:pStyle w:val="Compact"/>
+              <w:jc w:val="left"/>
+            </w:pPr>
+            <w:r>
+              <w:rPr>
+                <w:rStyle w:val="VerbatimChar"/>
+              </w:rPr>
+              <w:t xml:space="preserve">QNSC_SYSDBG_MAS</w:t>
+            </w:r>
+            <w:r>
+              <w:t xml:space="preserve"> </w:t>
+            </w:r>
+            <w:r>
+              <w:t xml:space="preserve">7.1, 7.2, 7.8</w:t>
+            </w:r>
+          </w:p>
+        </w:tc>
+      </w:tr>
+      <w:tr>
+        <w:tc>
+          <w:tcPr/>
+          <w:p>
+            <w:pPr>
+              <w:pStyle w:val="Compact"/>
+              <w:jc w:val="left"/>
+            </w:pPr>
+            <w:r>
+              <w:t xml:space="preserve">SYSDBG releases the CPU reset</w:t>
             </w:r>
           </w:p>
         </w:tc>
@@ -3804,7 +4207,7 @@
               <w:jc w:val="left"/>
             </w:pPr>
             <w:r>
-              <w:t xml:space="preserve">bit 0 data ready; bits 1–3 overrun, parity, framing; bit 5</w:t>
+              <w:t xml:space="preserve">bit 0 data ready; bit 5</w:t>
             </w:r>
             <w:r>
               <w:t xml:space="preserve"> </w:t>
@@ -3826,6 +4229,9 @@
                 <w:rStyle w:val="VerbatimChar"/>
               </w:rPr>
               <w:t xml:space="preserve">TEMT</w:t>
+            </w:r>
+            <w:r>
+              <w:t xml:space="preserve">. Bits 1–3, the line errors, are not read</w:t>
             </w:r>
           </w:p>
         </w:tc>
@@ -3892,7 +4298,7 @@
         <w:t xml:space="preserve"> </w:t>
       </w:r>
       <w:r>
-        <w:t xml:space="preserve">an error bit (1 to 3) set is a UART error; bit 0 set means a byte waits in</w:t>
+        <w:t xml:space="preserve">bit 0 set means a byte waits in</w:t>
       </w:r>
       <w:r>
         <w:t xml:space="preserve"> </w:t>
@@ -3904,13 +4310,7 @@
         <w:t xml:space="preserve">RBR</w:t>
       </w:r>
       <w:r>
-        <w:t xml:space="preserve">,</w:t>
-      </w:r>
-      <w:r>
-        <w:t xml:space="preserve"> </w:t>
-      </w:r>
-      <w:r>
-        <w:t xml:space="preserve">which it then reads; otherwise it reads</w:t>
+        <w:t xml:space="preserve">, which it then reads; otherwise it reads</w:t>
       </w:r>
       <w:r>
         <w:t xml:space="preserve"> </w:t>
@@ -3940,13 +4340,7 @@
         <w:t xml:space="preserve"> </w:t>
       </w:r>
       <w:r>
-        <w:t xml:space="preserve">the</w:t>
-      </w:r>
-      <w:r>
-        <w:t xml:space="preserve"> </w:t>
-      </w:r>
-      <w:r>
-        <w:t xml:space="preserve">loop has no limit; after</w:t>
+        <w:t xml:space="preserve">the loop has no limit; after</w:t>
       </w:r>
       <w:r>
         <w:t xml:space="preserve"> </w:t>
@@ -3961,7 +4355,13 @@
         <w:t xml:space="preserve"> </w:t>
       </w:r>
       <w:r>
-        <w:t xml:space="preserve">it counts the polls against</w:t>
+        <w:t xml:space="preserve">it counts the</w:t>
+      </w:r>
+      <w:r>
+        <w:t xml:space="preserve"> </w:t>
+      </w:r>
+      <w:r>
+        <w:t xml:space="preserve">polls against</w:t>
       </w:r>
       <w:r>
         <w:t xml:space="preserve"> </w:t>
@@ -3976,13 +4376,7 @@
         <w:t xml:space="preserve"> </w:t>
       </w:r>
       <w:r>
-        <w:t xml:space="preserve">(7.3). To</w:t>
-      </w:r>
-      <w:r>
-        <w:t xml:space="preserve"> </w:t>
-      </w:r>
-      <w:r>
-        <w:t xml:space="preserve">send, it waits for</w:t>
+        <w:t xml:space="preserve">(7.3). To send, it waits for</w:t>
       </w:r>
       <w:r>
         <w:t xml:space="preserve"> </w:t>
@@ -4012,6 +4406,68 @@
         <w:t xml:space="preserve">.</w:t>
       </w:r>
     </w:p>
+    <w:p>
+      <w:pPr>
+        <w:pStyle w:val="BodyText"/>
+      </w:pPr>
+      <w:r>
+        <w:t xml:space="preserve">The ROM ignores the line error bits. With 8N1 there is no parity error. A byte</w:t>
+      </w:r>
+      <w:r>
+        <w:t xml:space="preserve"> </w:t>
+      </w:r>
+      <w:r>
+        <w:t xml:space="preserve">received with a framing error is kept as it is and fails a CRC (</w:t>
+      </w:r>
+      <w:r>
+        <w:rPr>
+          <w:rStyle w:val="VerbatimChar"/>
+        </w:rPr>
+        <w:t xml:space="preserve">FHCR</w:t>
+      </w:r>
+      <w:r>
+        <w:t xml:space="preserve"> </w:t>
+      </w:r>
+      <w:r>
+        <w:t xml:space="preserve">or</w:t>
+      </w:r>
+      <w:r>
+        <w:t xml:space="preserve"> </w:t>
+      </w:r>
+      <w:r>
+        <w:rPr>
+          <w:rStyle w:val="VerbatimChar"/>
+        </w:rPr>
+        <w:t xml:space="preserve">FPCR</w:t>
+      </w:r>
+      <w:r>
+        <w:t xml:space="preserve">).</w:t>
+      </w:r>
+      <w:r>
+        <w:t xml:space="preserve"> </w:t>
+      </w:r>
+      <w:r>
+        <w:t xml:space="preserve">A byte lost to an overrun leaves the frame one byte short, so the ROM waits for a</w:t>
+      </w:r>
+      <w:r>
+        <w:t xml:space="preserve"> </w:t>
+      </w:r>
+      <w:r>
+        <w:t xml:space="preserve">byte that never comes and sends</w:t>
+      </w:r>
+      <w:r>
+        <w:t xml:space="preserve"> </w:t>
+      </w:r>
+      <w:r>
+        <w:rPr>
+          <w:rStyle w:val="VerbatimChar"/>
+        </w:rPr>
+        <w:t xml:space="preserve">FTMO</w:t>
+      </w:r>
+      <w:r>
+        <w:t xml:space="preserve">. Either way the PC resends the frame.</w:t>
+      </w:r>
+    </w:p>
     <w:bookmarkEnd w:id="32"/>
     <w:bookmarkStart w:id="36" w:name="frame-format"/>
     <w:p>
@@ -4030,7 +4486,7 @@
       <w:r>
         <w:drawing>
           <wp:inline>
-            <wp:extent cx="5727700" cy="1067189"/>
+            <wp:extent cx="5727700" cy="1396568"/>
             <wp:effectExtent b="0" l="0" r="0" t="0"/>
             <wp:docPr descr="Boot frame; every field little-endian" title="" id="34" name="Picture"/>
             <a:graphic>
@@ -4051,7 +4507,7 @@
                   <pic:spPr bwMode="auto">
                     <a:xfrm>
                       <a:off x="0" y="0"/>
-                      <a:ext cx="5727700" cy="1067189"/>
+                      <a:ext cx="5727700" cy="1396568"/>
                     </a:xfrm>
                     <a:prstGeom prst="rect">
                       <a:avLst/>
@@ -4287,7 +4743,7 @@
               <w:jc w:val="left"/>
             </w:pPr>
             <w:r>
-              <w:t xml:space="preserve">multiple of 4, 4 to 61 440</w:t>
+              <w:t xml:space="preserve">multiple of 4, 132 to 61 440</w:t>
             </w:r>
           </w:p>
         </w:tc>
@@ -4319,70 +4775,37 @@
               <w:rPr>
                 <w:rStyle w:val="VerbatimChar"/>
               </w:rPr>
-              <w:t xml:space="preserve">LOAD_ADDR</w:t>
-            </w:r>
-          </w:p>
-        </w:tc>
-        <w:tc>
-          <w:tcPr/>
-          <w:p>
-            <w:pPr>
-              <w:pStyle w:val="Compact"/>
-              <w:jc w:val="left"/>
-            </w:pPr>
-            <w:r>
-              <w:t xml:space="preserve">multiple of 4, &gt;=</w:t>
-            </w:r>
-            <w:r>
-              <w:t xml:space="preserve"> </w:t>
-            </w:r>
-            <w:r>
-              <w:rPr>
-                <w:rStyle w:val="VerbatimChar"/>
-              </w:rPr>
-              <w:t xml:space="preserve">0x2000_1000</w:t>
-            </w:r>
-            <w:r>
-              <w:t xml:space="preserve">,</w:t>
-            </w:r>
-            <w:r>
-              <w:t xml:space="preserve"> </w:t>
-            </w:r>
-            <w:r>
-              <w:rPr>
-                <w:rStyle w:val="VerbatimChar"/>
-              </w:rPr>
-              <w:t xml:space="preserve">LOAD_ADDR</w:t>
-            </w:r>
-            <w:r>
-              <w:t xml:space="preserve"> </w:t>
-            </w:r>
-            <w:r>
-              <w:t xml:space="preserve">+</w:t>
-            </w:r>
-            <w:r>
-              <w:t xml:space="preserve"> </w:t>
-            </w:r>
-            <w:r>
-              <w:rPr>
-                <w:rStyle w:val="VerbatimChar"/>
-              </w:rPr>
-              <w:t xml:space="preserve">LENGTH</w:t>
-            </w:r>
-            <w:r>
-              <w:t xml:space="preserve"> </w:t>
-            </w:r>
-            <w:r>
-              <w:t xml:space="preserve">&lt;=</w:t>
-            </w:r>
-            <w:r>
-              <w:t xml:space="preserve"> </w:t>
-            </w:r>
-            <w:r>
-              <w:rPr>
-                <w:rStyle w:val="VerbatimChar"/>
-              </w:rPr>
-              <w:t xml:space="preserve">0x2001_0000</w:t>
+              <w:t xml:space="preserve">HDR_CRC</w:t>
+            </w:r>
+          </w:p>
+        </w:tc>
+        <w:tc>
+          <w:tcPr/>
+          <w:p>
+            <w:pPr>
+              <w:pStyle w:val="Compact"/>
+              <w:jc w:val="left"/>
+            </w:pPr>
+            <w:r>
+              <w:t xml:space="preserve">CRC32 of bytes</w:t>
+            </w:r>
+            <w:r>
+              <w:t xml:space="preserve"> </w:t>
+            </w:r>
+            <w:r>
+              <w:rPr>
+                <w:rStyle w:val="VerbatimChar"/>
+              </w:rPr>
+              <w:t xml:space="preserve">0x00</w:t>
+            </w:r>
+            <w:r>
+              <w:t xml:space="preserve">–</w:t>
+            </w:r>
+            <w:r>
+              <w:rPr>
+                <w:rStyle w:val="VerbatimChar"/>
+              </w:rPr>
+              <w:t xml:space="preserve">0x07</w:t>
             </w:r>
           </w:p>
         </w:tc>
@@ -4414,73 +4837,52 @@
               <w:rPr>
                 <w:rStyle w:val="VerbatimChar"/>
               </w:rPr>
-              <w:t xml:space="preserve">ENTRY</w:t>
-            </w:r>
-          </w:p>
-        </w:tc>
-        <w:tc>
-          <w:tcPr/>
-          <w:p>
-            <w:pPr>
-              <w:pStyle w:val="Compact"/>
-              <w:jc w:val="left"/>
-            </w:pPr>
-            <w:r>
-              <w:t xml:space="preserve">even,</w:t>
-            </w:r>
-            <w:r>
-              <w:t xml:space="preserve"> </w:t>
-            </w:r>
-            <w:r>
-              <w:rPr>
-                <w:rStyle w:val="VerbatimChar"/>
-              </w:rPr>
-              <w:t xml:space="preserve">LOAD_ADDR</w:t>
-            </w:r>
-            <w:r>
-              <w:t xml:space="preserve"> </w:t>
-            </w:r>
-            <w:r>
-              <w:t xml:space="preserve">&lt;=</w:t>
-            </w:r>
-            <w:r>
-              <w:t xml:space="preserve"> </w:t>
-            </w:r>
-            <w:r>
-              <w:rPr>
-                <w:rStyle w:val="VerbatimChar"/>
-              </w:rPr>
-              <w:t xml:space="preserve">ENTRY</w:t>
-            </w:r>
-            <w:r>
-              <w:t xml:space="preserve"> </w:t>
-            </w:r>
-            <w:r>
-              <w:t xml:space="preserve">&lt;</w:t>
-            </w:r>
-            <w:r>
-              <w:t xml:space="preserve"> </w:t>
-            </w:r>
-            <w:r>
-              <w:rPr>
-                <w:rStyle w:val="VerbatimChar"/>
-              </w:rPr>
-              <w:t xml:space="preserve">LOAD_ADDR</w:t>
-            </w:r>
-            <w:r>
-              <w:t xml:space="preserve"> </w:t>
-            </w:r>
-            <w:r>
-              <w:t xml:space="preserve">+</w:t>
-            </w:r>
-            <w:r>
-              <w:t xml:space="preserve"> </w:t>
-            </w:r>
+              <w:t xml:space="preserve">PAYLOAD</w:t>
+            </w:r>
+          </w:p>
+        </w:tc>
+        <w:tc>
+          <w:tcPr/>
+          <w:p>
+            <w:pPr>
+              <w:pStyle w:val="Compact"/>
+              <w:jc w:val="left"/>
+            </w:pPr>
             <w:r>
               <w:rPr>
                 <w:rStyle w:val="VerbatimChar"/>
               </w:rPr>
               <w:t xml:space="preserve">LENGTH</w:t>
+            </w:r>
+            <w:r>
+              <w:t xml:space="preserve"> </w:t>
+            </w:r>
+            <w:r>
+              <w:t xml:space="preserve">bytes of the application binary, zero-padded by the PC; written to</w:t>
+            </w:r>
+            <w:r>
+              <w:t xml:space="preserve"> </w:t>
+            </w:r>
+            <w:r>
+              <w:rPr>
+                <w:rStyle w:val="VerbatimChar"/>
+              </w:rPr>
+              <w:t xml:space="preserve">ISRAM</w:t>
+            </w:r>
+            <w:r>
+              <w:t xml:space="preserve"> </w:t>
+            </w:r>
+            <w:r>
+              <w:t xml:space="preserve">from</w:t>
+            </w:r>
+            <w:r>
+              <w:t xml:space="preserve"> </w:t>
+            </w:r>
+            <w:r>
+              <w:rPr>
+                <w:rStyle w:val="VerbatimChar"/>
+              </w:rPr>
+              <w:t xml:space="preserve">0x2000_1000</w:t>
             </w:r>
           </w:p>
         </w:tc>
@@ -4497,122 +4899,7 @@
               <w:rPr>
                 <w:rStyle w:val="VerbatimChar"/>
               </w:rPr>
-              <w:t xml:space="preserve">0x10</w:t>
-            </w:r>
-          </w:p>
-        </w:tc>
-        <w:tc>
-          <w:tcPr/>
-          <w:p>
-            <w:pPr>
-              <w:pStyle w:val="Compact"/>
-              <w:jc w:val="left"/>
-            </w:pPr>
-            <w:r>
-              <w:rPr>
-                <w:rStyle w:val="VerbatimChar"/>
-              </w:rPr>
-              <w:t xml:space="preserve">HDR_CRC</w:t>
-            </w:r>
-          </w:p>
-        </w:tc>
-        <w:tc>
-          <w:tcPr/>
-          <w:p>
-            <w:pPr>
-              <w:pStyle w:val="Compact"/>
-              <w:jc w:val="left"/>
-            </w:pPr>
-            <w:r>
-              <w:t xml:space="preserve">CRC32 of bytes</w:t>
-            </w:r>
-            <w:r>
-              <w:t xml:space="preserve"> </w:t>
-            </w:r>
-            <w:r>
-              <w:rPr>
-                <w:rStyle w:val="VerbatimChar"/>
-              </w:rPr>
-              <w:t xml:space="preserve">0x00</w:t>
-            </w:r>
-            <w:r>
-              <w:t xml:space="preserve">–</w:t>
-            </w:r>
-            <w:r>
-              <w:rPr>
-                <w:rStyle w:val="VerbatimChar"/>
-              </w:rPr>
-              <w:t xml:space="preserve">0x0F</w:t>
-            </w:r>
-          </w:p>
-        </w:tc>
-      </w:tr>
-      <w:tr>
-        <w:tc>
-          <w:tcPr/>
-          <w:p>
-            <w:pPr>
-              <w:pStyle w:val="Compact"/>
-              <w:jc w:val="left"/>
-            </w:pPr>
-            <w:r>
-              <w:rPr>
-                <w:rStyle w:val="VerbatimChar"/>
-              </w:rPr>
-              <w:t xml:space="preserve">0x14</w:t>
-            </w:r>
-          </w:p>
-        </w:tc>
-        <w:tc>
-          <w:tcPr/>
-          <w:p>
-            <w:pPr>
-              <w:pStyle w:val="Compact"/>
-              <w:jc w:val="left"/>
-            </w:pPr>
-            <w:r>
-              <w:rPr>
-                <w:rStyle w:val="VerbatimChar"/>
-              </w:rPr>
-              <w:t xml:space="preserve">PAYLOAD</w:t>
-            </w:r>
-          </w:p>
-        </w:tc>
-        <w:tc>
-          <w:tcPr/>
-          <w:p>
-            <w:pPr>
-              <w:pStyle w:val="Compact"/>
-              <w:jc w:val="left"/>
-            </w:pPr>
-            <w:r>
-              <w:rPr>
-                <w:rStyle w:val="VerbatimChar"/>
-              </w:rPr>
-              <w:t xml:space="preserve">LENGTH</w:t>
-            </w:r>
-            <w:r>
-              <w:t xml:space="preserve"> </w:t>
-            </w:r>
-            <w:r>
-              <w:t xml:space="preserve">bytes of the application binary, zero-padded by the PC</w:t>
-            </w:r>
-          </w:p>
-        </w:tc>
-      </w:tr>
-      <w:tr>
-        <w:tc>
-          <w:tcPr/>
-          <w:p>
-            <w:pPr>
-              <w:pStyle w:val="Compact"/>
-              <w:jc w:val="left"/>
-            </w:pPr>
-            <w:r>
-              <w:rPr>
-                <w:rStyle w:val="VerbatimChar"/>
-              </w:rPr>
-              <w:t xml:space="preserve">0x14</w:t>
+              <w:t xml:space="preserve">0x0C</w:t>
             </w:r>
             <w:r>
               <w:t xml:space="preserve"> </w:t>
@@ -4669,6 +4956,128 @@
         </w:tc>
       </w:tr>
     </w:tbl>
+    <w:p>
+      <w:pPr>
+        <w:pStyle w:val="BodyText"/>
+      </w:pPr>
+      <w:r>
+        <w:t xml:space="preserve">The frame carries no address. The payload always goes to</w:t>
+      </w:r>
+      <w:r>
+        <w:t xml:space="preserve"> </w:t>
+      </w:r>
+      <w:r>
+        <w:rPr>
+          <w:rStyle w:val="VerbatimChar"/>
+        </w:rPr>
+        <w:t xml:space="preserve">0x2000_1000</w:t>
+      </w:r>
+      <w:r>
+        <w:t xml:space="preserve"> </w:t>
+      </w:r>
+      <w:r>
+        <w:t xml:space="preserve">and the ROM</w:t>
+      </w:r>
+      <w:r>
+        <w:t xml:space="preserve"> </w:t>
+      </w:r>
+      <w:r>
+        <w:t xml:space="preserve">always jumps to</w:t>
+      </w:r>
+      <w:r>
+        <w:t xml:space="preserve"> </w:t>
+      </w:r>
+      <w:r>
+        <w:rPr>
+          <w:rStyle w:val="VerbatimChar"/>
+        </w:rPr>
+        <w:t xml:space="preserve">0x2000_1080</w:t>
+      </w:r>
+      <w:r>
+        <w:t xml:space="preserve">: the addresses at which debug boot loads and starts</w:t>
+      </w:r>
+      <w:r>
+        <w:t xml:space="preserve"> </w:t>
+      </w:r>
+      <w:r>
+        <w:t xml:space="preserve">an image (</w:t>
+      </w:r>
+      <w:r>
+        <w:rPr>
+          <w:rStyle w:val="VerbatimChar"/>
+        </w:rPr>
+        <w:t xml:space="preserve">QNSC_SYSDBG_MAS</w:t>
+      </w:r>
+      <w:r>
+        <w:t xml:space="preserve"> </w:t>
+      </w:r>
+      <w:r>
+        <w:t xml:space="preserve">7.2), so one image serves both modes.</w:t>
+      </w:r>
+      <w:r>
+        <w:t xml:space="preserve"> </w:t>
+      </w:r>
+      <w:r>
+        <w:rPr>
+          <w:rStyle w:val="VerbatimChar"/>
+        </w:rPr>
+        <w:t xml:space="preserve">LENGTH</w:t>
+      </w:r>
+      <w:r>
+        <w:t xml:space="preserve"> </w:t>
+      </w:r>
+      <w:r>
+        <w:t xml:space="preserve">is at</w:t>
+      </w:r>
+      <w:r>
+        <w:t xml:space="preserve"> </w:t>
+      </w:r>
+      <w:r>
+        <w:t xml:space="preserve">least 132 so that the image reaches the first instruction at</w:t>
+      </w:r>
+      <w:r>
+        <w:t xml:space="preserve"> </w:t>
+      </w:r>
+      <w:r>
+        <w:rPr>
+          <w:rStyle w:val="VerbatimChar"/>
+        </w:rPr>
+        <w:t xml:space="preserve">0x2000_1080</w:t>
+      </w:r>
+      <w:r>
+        <w:t xml:space="preserve">, and at</w:t>
+      </w:r>
+      <w:r>
+        <w:t xml:space="preserve"> </w:t>
+      </w:r>
+      <w:r>
+        <w:t xml:space="preserve">most 61 440 so that it ends inside</w:t>
+      </w:r>
+      <w:r>
+        <w:t xml:space="preserve"> </w:t>
+      </w:r>
+      <w:r>
+        <w:rPr>
+          <w:rStyle w:val="VerbatimChar"/>
+        </w:rPr>
+        <w:t xml:space="preserve">ISRAM</w:t>
+      </w:r>
+      <w:r>
+        <w:t xml:space="preserve">, at</w:t>
+      </w:r>
+      <w:r>
+        <w:t xml:space="preserve"> </w:t>
+      </w:r>
+      <w:r>
+        <w:rPr>
+          <w:rStyle w:val="VerbatimChar"/>
+        </w:rPr>
+        <w:t xml:space="preserve">0x2001_0000</w:t>
+      </w:r>
+      <w:r>
+        <w:t xml:space="preserve">.</w:t>
+      </w:r>
+    </w:p>
     <w:p>
       <w:pPr>
         <w:pStyle w:val="BodyText"/>
@@ -4725,7 +5134,7 @@
       <w:r>
         <w:drawing>
           <wp:inline>
-            <wp:extent cx="3749040" cy="7127295"/>
+            <wp:extent cx="3749040" cy="6200335"/>
             <wp:effectExtent b="0" l="0" r="0" t="0"/>
             <wp:docPr descr="Bootloader flow" title="" id="38" name="Picture"/>
             <a:graphic>
@@ -4746,7 +5155,7 @@
                   <pic:spPr bwMode="auto">
                     <a:xfrm>
                       <a:off x="0" y="0"/>
-                      <a:ext cx="3749040" cy="7127295"/>
+                      <a:ext cx="3749040" cy="6200335"/>
                     </a:xfrm>
                     <a:prstGeom prst="rect">
                       <a:avLst/>
@@ -4785,34 +5194,7 @@
         <w:t xml:space="preserve"> </w:t>
       </w:r>
       <w:r>
-        <w:t xml:space="preserve">check is done by the bootloader in software;</w:t>
-      </w:r>
-      <w:r>
-        <w:t xml:space="preserve"> </w:t>
-      </w:r>
-      <w:r>
-        <w:rPr>
-          <w:rStyle w:val="VerbatimChar"/>
-        </w:rPr>
-        <w:t xml:space="preserve">UART0</w:t>
-      </w:r>
-      <w:r>
-        <w:t xml:space="preserve"> </w:t>
-      </w:r>
-      <w:r>
-        <w:t xml:space="preserve">only flags line errors in</w:t>
-      </w:r>
-      <w:r>
-        <w:t xml:space="preserve"> </w:t>
-      </w:r>
-      <w:r>
-        <w:rPr>
-          <w:rStyle w:val="VerbatimChar"/>
-        </w:rPr>
-        <w:t xml:space="preserve">LSR</w:t>
-      </w:r>
-      <w:r>
-        <w:t xml:space="preserve">.</w:t>
+        <w:t xml:space="preserve">check is done by the bootloader in software.</w:t>
       </w:r>
     </w:p>
     <w:p>
@@ -5014,7 +5396,7 @@
               <w:t xml:space="preserve">MAGIC</w:t>
             </w:r>
             <w:r>
-              <w:t xml:space="preserve">. A byte with a UART error is dropped. Nothing is sent.</w:t>
+              <w:t xml:space="preserve">. Nothing is sent.</w:t>
             </w:r>
           </w:p>
         </w:tc>
@@ -5040,7 +5422,7 @@
               <w:jc w:val="left"/>
             </w:pPr>
             <w:r>
-              <w:t xml:space="preserve">waiting for the next header byte</w:t>
+              <w:t xml:space="preserve">waiting for the next header byte: LENGTH, HDR_CRC</w:t>
             </w:r>
           </w:p>
         </w:tc>
@@ -5067,7 +5449,7 @@
               <w:t xml:space="preserve"> </w:t>
             </w:r>
             <w:r>
-              <w:t xml:space="preserve">for the 16 bytes of</w:t>
+              <w:t xml:space="preserve">for the 8 bytes of</w:t>
             </w:r>
             <w:r>
               <w:t xml:space="preserve"> </w:t>
@@ -5079,30 +5461,6 @@
               <w:t xml:space="preserve">LENGTH</w:t>
             </w:r>
             <w:r>
-              <w:t xml:space="preserve">,</w:t>
-            </w:r>
-            <w:r>
-              <w:t xml:space="preserve"> </w:t>
-            </w:r>
-            <w:r>
-              <w:rPr>
-                <w:rStyle w:val="VerbatimChar"/>
-              </w:rPr>
-              <w:t xml:space="preserve">LOAD_ADDR</w:t>
-            </w:r>
-            <w:r>
-              <w:t xml:space="preserve">,</w:t>
-            </w:r>
-            <w:r>
-              <w:t xml:space="preserve"> </w:t>
-            </w:r>
-            <w:r>
-              <w:rPr>
-                <w:rStyle w:val="VerbatimChar"/>
-              </w:rPr>
-              <w:t xml:space="preserve">ENTRY</w:t>
-            </w:r>
-            <w:r>
               <w:t xml:space="preserve"> </w:t>
             </w:r>
             <w:r>
@@ -5133,7 +5491,22 @@
               <w:t xml:space="preserve"> </w:t>
             </w:r>
             <w:r>
-              <w:t xml:space="preserve">and the three fields as they arrive.</w:t>
+              <w:t xml:space="preserve">and</w:t>
+            </w:r>
+            <w:r>
+              <w:t xml:space="preserve"> </w:t>
+            </w:r>
+            <w:r>
+              <w:rPr>
+                <w:rStyle w:val="VerbatimChar"/>
+              </w:rPr>
+              <w:t xml:space="preserve">LENGTH</w:t>
+            </w:r>
+            <w:r>
+              <w:t xml:space="preserve"> </w:t>
+            </w:r>
+            <w:r>
+              <w:t xml:space="preserve">as they arrive.</w:t>
             </w:r>
           </w:p>
         </w:tc>
@@ -5159,49 +5532,40 @@
               <w:jc w:val="left"/>
             </w:pPr>
             <w:r>
-              <w:t xml:space="preserve">UART error?</w:t>
-            </w:r>
-          </w:p>
-        </w:tc>
-        <w:tc>
-          <w:tcPr/>
-          <w:p>
-            <w:pPr>
-              <w:pStyle w:val="Compact"/>
-              <w:jc w:val="left"/>
-            </w:pPr>
-            <w:r>
-              <w:rPr>
-                <w:rStyle w:val="VerbatimChar"/>
-              </w:rPr>
-              <w:t xml:space="preserve">LSR</w:t>
-            </w:r>
-            <w:r>
-              <w:t xml:space="preserve"> </w:t>
-            </w:r>
-            <w:r>
-              <w:t xml:space="preserve">bit 1, 2 or 3 (overrun, parity, framing) is set when the byte is read.</w:t>
-            </w:r>
-          </w:p>
-        </w:tc>
-        <w:tc>
-          <w:tcPr/>
-          <w:p>
-            <w:pPr>
-              <w:pStyle w:val="Compact"/>
-              <w:jc w:val="left"/>
-            </w:pPr>
-            <w:r>
-              <w:t xml:space="preserve">yes:</w:t>
-            </w:r>
-            <w:r>
-              <w:t xml:space="preserve"> </w:t>
-            </w:r>
-            <w:r>
-              <w:rPr>
-                <w:rStyle w:val="VerbatimChar"/>
-              </w:rPr>
-              <w:t xml:space="preserve">FUAR</w:t>
+              <w:t xml:space="preserve">new byte within RX_TIMEOUT polls?</w:t>
+            </w:r>
+          </w:p>
+        </w:tc>
+        <w:tc>
+          <w:tcPr/>
+          <w:p>
+            <w:pPr>
+              <w:pStyle w:val="Compact"/>
+              <w:jc w:val="left"/>
+            </w:pPr>
+            <w:r>
+              <w:t xml:space="preserve">The poll count restarts at every byte (7.3).</w:t>
+            </w:r>
+          </w:p>
+        </w:tc>
+        <w:tc>
+          <w:tcPr/>
+          <w:p>
+            <w:pPr>
+              <w:pStyle w:val="Compact"/>
+              <w:jc w:val="left"/>
+            </w:pPr>
+            <w:r>
+              <w:t xml:space="preserve">no:</w:t>
+            </w:r>
+            <w:r>
+              <w:t xml:space="preserve"> </w:t>
+            </w:r>
+            <w:r>
+              <w:rPr>
+                <w:rStyle w:val="VerbatimChar"/>
+              </w:rPr>
+              <w:t xml:space="preserve">FTMO</w:t>
             </w:r>
           </w:p>
         </w:tc>
@@ -5215,40 +5579,31 @@
               <w:jc w:val="left"/>
             </w:pPr>
             <w:r>
-              <w:t xml:space="preserve">byte within RX_TIMEOUT polls?</w:t>
-            </w:r>
-          </w:p>
-        </w:tc>
-        <w:tc>
-          <w:tcPr/>
-          <w:p>
-            <w:pPr>
-              <w:pStyle w:val="Compact"/>
-              <w:jc w:val="left"/>
-            </w:pPr>
-            <w:r>
-              <w:t xml:space="preserve">The poll count restarts at every byte (7.3).</w:t>
-            </w:r>
-          </w:p>
-        </w:tc>
-        <w:tc>
-          <w:tcPr/>
-          <w:p>
-            <w:pPr>
-              <w:pStyle w:val="Compact"/>
-              <w:jc w:val="left"/>
-            </w:pPr>
-            <w:r>
-              <w:t xml:space="preserve">no:</w:t>
-            </w:r>
-            <w:r>
-              <w:t xml:space="preserve"> </w:t>
-            </w:r>
-            <w:r>
-              <w:rPr>
-                <w:rStyle w:val="VerbatimChar"/>
-              </w:rPr>
-              <w:t xml:space="preserve">FTMO</w:t>
+              <w:t xml:space="preserve">8 header bytes received?</w:t>
+            </w:r>
+          </w:p>
+        </w:tc>
+        <w:tc>
+          <w:tcPr/>
+          <w:p>
+            <w:pPr>
+              <w:pStyle w:val="Compact"/>
+              <w:jc w:val="left"/>
+            </w:pPr>
+            <w:r>
+              <w:t xml:space="preserve">No: wait for the next header byte.</w:t>
+            </w:r>
+          </w:p>
+        </w:tc>
+        <w:tc>
+          <w:tcPr/>
+          <w:p>
+            <w:pPr>
+              <w:pStyle w:val="Compact"/>
+              <w:jc w:val="left"/>
+            </w:pPr>
+            <w:r>
+              <w:t xml:space="preserve">–</w:t>
             </w:r>
           </w:p>
         </w:tc>
@@ -5262,31 +5617,52 @@
               <w:jc w:val="left"/>
             </w:pPr>
             <w:r>
-              <w:t xml:space="preserve">16 header bytes includes HDR_CRC received?</w:t>
-            </w:r>
-          </w:p>
-        </w:tc>
-        <w:tc>
-          <w:tcPr/>
-          <w:p>
-            <w:pPr>
-              <w:pStyle w:val="Compact"/>
-              <w:jc w:val="left"/>
-            </w:pPr>
-            <w:r>
-              <w:t xml:space="preserve">No: wait for the next header byte.</w:t>
-            </w:r>
-          </w:p>
-        </w:tc>
-        <w:tc>
-          <w:tcPr/>
-          <w:p>
-            <w:pPr>
-              <w:pStyle w:val="Compact"/>
-              <w:jc w:val="left"/>
-            </w:pPr>
-            <w:r>
-              <w:t xml:space="preserve">–</w:t>
+              <w:t xml:space="preserve">CRC32 = HDR_CRC?</w:t>
+            </w:r>
+          </w:p>
+        </w:tc>
+        <w:tc>
+          <w:tcPr/>
+          <w:p>
+            <w:pPr>
+              <w:pStyle w:val="Compact"/>
+              <w:jc w:val="left"/>
+            </w:pPr>
+            <w:r>
+              <w:t xml:space="preserve">Checked before</w:t>
+            </w:r>
+            <w:r>
+              <w:t xml:space="preserve"> </w:t>
+            </w:r>
+            <w:r>
+              <w:rPr>
+                <w:rStyle w:val="VerbatimChar"/>
+              </w:rPr>
+              <w:t xml:space="preserve">LENGTH</w:t>
+            </w:r>
+            <w:r>
+              <w:t xml:space="preserve">: with a wrong CRC its value means nothing.</w:t>
+            </w:r>
+          </w:p>
+        </w:tc>
+        <w:tc>
+          <w:tcPr/>
+          <w:p>
+            <w:pPr>
+              <w:pStyle w:val="Compact"/>
+              <w:jc w:val="left"/>
+            </w:pPr>
+            <w:r>
+              <w:t xml:space="preserve">no:</w:t>
+            </w:r>
+            <w:r>
+              <w:t xml:space="preserve"> </w:t>
+            </w:r>
+            <w:r>
+              <w:rPr>
+                <w:rStyle w:val="VerbatimChar"/>
+              </w:rPr>
+              <w:t xml:space="preserve">FHCR</w:t>
             </w:r>
           </w:p>
         </w:tc>
@@ -5300,19 +5676,61 @@
               <w:jc w:val="left"/>
             </w:pPr>
             <w:r>
-              <w:t xml:space="preserve">CRC32 = HDR_CRC?</w:t>
-            </w:r>
-          </w:p>
-        </w:tc>
-        <w:tc>
-          <w:tcPr/>
-          <w:p>
-            <w:pPr>
-              <w:pStyle w:val="Compact"/>
-              <w:jc w:val="left"/>
-            </w:pPr>
-            <w:r>
-              <w:t xml:space="preserve">Checked before the fields: with a wrong CRC they mean nothing.</w:t>
+              <w:t xml:space="preserve">LENGTH valid?</w:t>
+            </w:r>
+          </w:p>
+        </w:tc>
+        <w:tc>
+          <w:tcPr/>
+          <w:p>
+            <w:pPr>
+              <w:pStyle w:val="Compact"/>
+              <w:jc w:val="left"/>
+            </w:pPr>
+            <w:r>
+              <w:t xml:space="preserve">The CRC only shows that the bytes arrived as the PC sent them, not that the value makes sense.</w:t>
+            </w:r>
+            <w:r>
+              <w:t xml:space="preserve"> </w:t>
+            </w:r>
+            <w:r>
+              <w:rPr>
+                <w:rStyle w:val="VerbatimChar"/>
+              </w:rPr>
+              <w:t xml:space="preserve">LENGTH</w:t>
+            </w:r>
+            <w:r>
+              <w:t xml:space="preserve"> </w:t>
+            </w:r>
+            <w:r>
+              <w:t xml:space="preserve">must be a multiple of 4 and 132 to 61 440 (Table 6-1), so the payload reaches</w:t>
+            </w:r>
+            <w:r>
+              <w:t xml:space="preserve"> </w:t>
+            </w:r>
+            <w:r>
+              <w:rPr>
+                <w:rStyle w:val="VerbatimChar"/>
+              </w:rPr>
+              <w:t xml:space="preserve">0x2000_1080</w:t>
+            </w:r>
+            <w:r>
+              <w:t xml:space="preserve"> </w:t>
+            </w:r>
+            <w:r>
+              <w:t xml:space="preserve">and stays inside</w:t>
+            </w:r>
+            <w:r>
+              <w:t xml:space="preserve"> </w:t>
+            </w:r>
+            <w:r>
+              <w:rPr>
+                <w:rStyle w:val="VerbatimChar"/>
+              </w:rPr>
+              <w:t xml:space="preserve">ISRAM</w:t>
+            </w:r>
+            <w:r>
+              <w:t xml:space="preserve">.</w:t>
             </w:r>
           </w:p>
         </w:tc>
@@ -5333,7 +5751,7 @@
               <w:rPr>
                 <w:rStyle w:val="VerbatimChar"/>
               </w:rPr>
-              <w:t xml:space="preserve">FHCR</w:t>
+              <w:t xml:space="preserve">FHDR</w:t>
             </w:r>
           </w:p>
         </w:tc>
@@ -5347,76 +5765,40 @@
               <w:jc w:val="left"/>
             </w:pPr>
             <w:r>
-              <w:t xml:space="preserve">fields in range?</w:t>
-            </w:r>
-          </w:p>
-        </w:tc>
-        <w:tc>
-          <w:tcPr/>
-          <w:p>
-            <w:pPr>
-              <w:pStyle w:val="Compact"/>
-              <w:jc w:val="left"/>
-            </w:pPr>
-            <w:r>
-              <w:rPr>
-                <w:rStyle w:val="VerbatimChar"/>
-              </w:rPr>
-              <w:t xml:space="preserve">LENGTH</w:t>
-            </w:r>
-            <w:r>
-              <w:t xml:space="preserve">,</w:t>
-            </w:r>
-            <w:r>
-              <w:t xml:space="preserve"> </w:t>
-            </w:r>
-            <w:r>
-              <w:rPr>
-                <w:rStyle w:val="VerbatimChar"/>
-              </w:rPr>
-              <w:t xml:space="preserve">LOAD_ADDR</w:t>
-            </w:r>
-            <w:r>
-              <w:t xml:space="preserve"> </w:t>
-            </w:r>
-            <w:r>
-              <w:t xml:space="preserve">and</w:t>
-            </w:r>
-            <w:r>
-              <w:t xml:space="preserve"> </w:t>
-            </w:r>
-            <w:r>
-              <w:rPr>
-                <w:rStyle w:val="VerbatimChar"/>
-              </w:rPr>
-              <w:t xml:space="preserve">ENTRY</w:t>
-            </w:r>
-            <w:r>
-              <w:t xml:space="preserve"> </w:t>
-            </w:r>
-            <w:r>
-              <w:t xml:space="preserve">against Table 6-1.</w:t>
-            </w:r>
-          </w:p>
-        </w:tc>
-        <w:tc>
-          <w:tcPr/>
-          <w:p>
-            <w:pPr>
-              <w:pStyle w:val="Compact"/>
-              <w:jc w:val="left"/>
-            </w:pPr>
-            <w:r>
-              <w:t xml:space="preserve">no:</w:t>
-            </w:r>
-            <w:r>
-              <w:t xml:space="preserve"> </w:t>
-            </w:r>
-            <w:r>
-              <w:rPr>
-                <w:rStyle w:val="VerbatimChar"/>
-              </w:rPr>
-              <w:t xml:space="preserve">FHDR</w:t>
+              <w:t xml:space="preserve">send ACKH</w:t>
+            </w:r>
+          </w:p>
+        </w:tc>
+        <w:tc>
+          <w:tcPr/>
+          <w:p>
+            <w:pPr>
+              <w:pStyle w:val="Compact"/>
+              <w:jc w:val="left"/>
+            </w:pPr>
+            <w:r>
+              <w:rPr>
+                <w:rStyle w:val="VerbatimChar"/>
+              </w:rPr>
+              <w:t xml:space="preserve">ISRAM</w:t>
+            </w:r>
+            <w:r>
+              <w:t xml:space="preserve"> </w:t>
+            </w:r>
+            <w:r>
+              <w:t xml:space="preserve">is written only after this token.</w:t>
+            </w:r>
+          </w:p>
+        </w:tc>
+        <w:tc>
+          <w:tcPr/>
+          <w:p>
+            <w:pPr>
+              <w:pStyle w:val="Compact"/>
+              <w:jc w:val="left"/>
+            </w:pPr>
+            <w:r>
+              <w:t xml:space="preserve">–</w:t>
             </w:r>
           </w:p>
         </w:tc>
@@ -5430,17 +5812,23 @@
               <w:jc w:val="left"/>
             </w:pPr>
             <w:r>
-              <w:t xml:space="preserve">send ACKH</w:t>
-            </w:r>
-          </w:p>
-        </w:tc>
-        <w:tc>
-          <w:tcPr/>
-          <w:p>
-            <w:pPr>
-              <w:pStyle w:val="Compact"/>
-              <w:jc w:val="left"/>
-            </w:pPr>
+              <w:t xml:space="preserve">waiting for the next payload or PAY_CRC byte; write the payload to 0x2000_1000 (ISRAM)</w:t>
+            </w:r>
+          </w:p>
+        </w:tc>
+        <w:tc>
+          <w:tcPr/>
+          <w:p>
+            <w:pPr>
+              <w:pStyle w:val="Compact"/>
+              <w:jc w:val="left"/>
+            </w:pPr>
+            <w:r>
+              <w:t xml:space="preserve">Every 4 payload bytes are written as one word to</w:t>
+            </w:r>
+            <w:r>
+              <w:t xml:space="preserve"> </w:t>
+            </w:r>
             <w:r>
               <w:rPr>
                 <w:rStyle w:val="VerbatimChar"/>
@@ -5448,10 +5836,34 @@
               <w:t xml:space="preserve">ISRAM</w:t>
             </w:r>
             <w:r>
-              <w:t xml:space="preserve"> </w:t>
-            </w:r>
-            <w:r>
-              <w:t xml:space="preserve">is written only after this token.</w:t>
+              <w:t xml:space="preserve">, the first at</w:t>
+            </w:r>
+            <w:r>
+              <w:t xml:space="preserve"> </w:t>
+            </w:r>
+            <w:r>
+              <w:rPr>
+                <w:rStyle w:val="VerbatimChar"/>
+              </w:rPr>
+              <w:t xml:space="preserve">0x2000_1000</w:t>
+            </w:r>
+            <w:r>
+              <w:t xml:space="preserve">, and fed to a second CRC32. The 4 bytes of</w:t>
+            </w:r>
+            <w:r>
+              <w:t xml:space="preserve"> </w:t>
+            </w:r>
+            <w:r>
+              <w:rPr>
+                <w:rStyle w:val="VerbatimChar"/>
+              </w:rPr>
+              <w:t xml:space="preserve">PAY_CRC</w:t>
+            </w:r>
+            <w:r>
+              <w:t xml:space="preserve"> </w:t>
+            </w:r>
+            <w:r>
+              <w:t xml:space="preserve">are neither written nor fed.</w:t>
             </w:r>
           </w:p>
         </w:tc>
@@ -5477,76 +5889,40 @@
               <w:jc w:val="left"/>
             </w:pPr>
             <w:r>
-              <w:t xml:space="preserve">wait for the next payload byte</w:t>
-            </w:r>
-          </w:p>
-        </w:tc>
-        <w:tc>
-          <w:tcPr/>
-          <w:p>
-            <w:pPr>
-              <w:pStyle w:val="Compact"/>
-              <w:jc w:val="left"/>
-            </w:pPr>
-            <w:r>
-              <w:t xml:space="preserve">Every 4 payload bytes are written as one word to</w:t>
-            </w:r>
-            <w:r>
-              <w:t xml:space="preserve"> </w:t>
-            </w:r>
-            <w:r>
-              <w:rPr>
-                <w:rStyle w:val="VerbatimChar"/>
-              </w:rPr>
-              <w:t xml:space="preserve">ISRAM</w:t>
-            </w:r>
-            <w:r>
-              <w:t xml:space="preserve"> </w:t>
-            </w:r>
-            <w:r>
-              <w:t xml:space="preserve">from</w:t>
-            </w:r>
-            <w:r>
-              <w:t xml:space="preserve"> </w:t>
-            </w:r>
-            <w:r>
-              <w:rPr>
-                <w:rStyle w:val="VerbatimChar"/>
-              </w:rPr>
-              <w:t xml:space="preserve">LOAD_ADDR</w:t>
-            </w:r>
-            <w:r>
-              <w:t xml:space="preserve"> </w:t>
-            </w:r>
-            <w:r>
-              <w:t xml:space="preserve">and fed to a second CRC32. The 4 bytes of</w:t>
-            </w:r>
-            <w:r>
-              <w:t xml:space="preserve"> </w:t>
-            </w:r>
-            <w:r>
-              <w:rPr>
-                <w:rStyle w:val="VerbatimChar"/>
-              </w:rPr>
-              <w:t xml:space="preserve">PAY_CRC</w:t>
-            </w:r>
-            <w:r>
-              <w:t xml:space="preserve"> </w:t>
-            </w:r>
-            <w:r>
-              <w:t xml:space="preserve">are neither written nor fed.</w:t>
-            </w:r>
-          </w:p>
-        </w:tc>
-        <w:tc>
-          <w:tcPr/>
-          <w:p>
-            <w:pPr>
-              <w:pStyle w:val="Compact"/>
-              <w:jc w:val="left"/>
-            </w:pPr>
-            <w:r>
-              <w:t xml:space="preserve">–</w:t>
+              <w:t xml:space="preserve">new byte within RX_TIMEOUT polls?</w:t>
+            </w:r>
+          </w:p>
+        </w:tc>
+        <w:tc>
+          <w:tcPr/>
+          <w:p>
+            <w:pPr>
+              <w:pStyle w:val="Compact"/>
+              <w:jc w:val="left"/>
+            </w:pPr>
+            <w:r>
+              <w:t xml:space="preserve">As for the header.</w:t>
+            </w:r>
+          </w:p>
+        </w:tc>
+        <w:tc>
+          <w:tcPr/>
+          <w:p>
+            <w:pPr>
+              <w:pStyle w:val="Compact"/>
+              <w:jc w:val="left"/>
+            </w:pPr>
+            <w:r>
+              <w:t xml:space="preserve">no:</w:t>
+            </w:r>
+            <w:r>
+              <w:t xml:space="preserve"> </w:t>
+            </w:r>
+            <w:r>
+              <w:rPr>
+                <w:rStyle w:val="VerbatimChar"/>
+              </w:rPr>
+              <w:t xml:space="preserve">FTMO</w:t>
             </w:r>
           </w:p>
         </w:tc>
@@ -5560,46 +5936,58 @@
               <w:jc w:val="left"/>
             </w:pPr>
             <w:r>
-              <w:t xml:space="preserve">UART error?, byte within RX_TIMEOUT polls?</w:t>
-            </w:r>
-          </w:p>
-        </w:tc>
-        <w:tc>
-          <w:tcPr/>
-          <w:p>
-            <w:pPr>
-              <w:pStyle w:val="Compact"/>
-              <w:jc w:val="left"/>
-            </w:pPr>
-            <w:r>
-              <w:t xml:space="preserve">As for the header.</w:t>
-            </w:r>
-          </w:p>
-        </w:tc>
-        <w:tc>
-          <w:tcPr/>
-          <w:p>
-            <w:pPr>
-              <w:pStyle w:val="Compact"/>
-              <w:jc w:val="left"/>
-            </w:pPr>
-            <w:r>
-              <w:rPr>
-                <w:rStyle w:val="VerbatimChar"/>
-              </w:rPr>
-              <w:t xml:space="preserve">FUAR</w:t>
-            </w:r>
-            <w:r>
-              <w:t xml:space="preserve">,</w:t>
-            </w:r>
-            <w:r>
-              <w:t xml:space="preserve"> </w:t>
-            </w:r>
-            <w:r>
-              <w:rPr>
-                <w:rStyle w:val="VerbatimChar"/>
-              </w:rPr>
-              <w:t xml:space="preserve">FTMO</w:t>
+              <w:t xml:space="preserve">all payload and PAY_CRC bytes received?</w:t>
+            </w:r>
+          </w:p>
+        </w:tc>
+        <w:tc>
+          <w:tcPr/>
+          <w:p>
+            <w:pPr>
+              <w:pStyle w:val="Compact"/>
+              <w:jc w:val="left"/>
+            </w:pPr>
+            <w:r>
+              <w:t xml:space="preserve">The loop bound only:</w:t>
+            </w:r>
+            <w:r>
+              <w:t xml:space="preserve"> </w:t>
+            </w:r>
+            <w:r>
+              <w:rPr>
+                <w:rStyle w:val="VerbatimChar"/>
+              </w:rPr>
+              <w:t xml:space="preserve">LENGTH</w:t>
+            </w:r>
+            <w:r>
+              <w:t xml:space="preserve"> </w:t>
+            </w:r>
+            <w:r>
+              <w:t xml:space="preserve">payload bytes, then 4 bytes of</w:t>
+            </w:r>
+            <w:r>
+              <w:t xml:space="preserve"> </w:t>
+            </w:r>
+            <w:r>
+              <w:rPr>
+                <w:rStyle w:val="VerbatimChar"/>
+              </w:rPr>
+              <w:t xml:space="preserve">PAY_CRC</w:t>
+            </w:r>
+            <w:r>
+              <w:t xml:space="preserve">. No: wait for the next byte.</w:t>
+            </w:r>
+          </w:p>
+        </w:tc>
+        <w:tc>
+          <w:tcPr/>
+          <w:p>
+            <w:pPr>
+              <w:pStyle w:val="Compact"/>
+              <w:jc w:val="left"/>
+            </w:pPr>
+            <w:r>
+              <w:t xml:space="preserve">–</w:t>
             </w:r>
           </w:p>
         </w:tc>
@@ -5613,46 +6001,52 @@
               <w:jc w:val="left"/>
             </w:pPr>
             <w:r>
-              <w:t xml:space="preserve">LENGTH payload bytes and PAY_CRC received?</w:t>
-            </w:r>
-          </w:p>
-        </w:tc>
-        <w:tc>
-          <w:tcPr/>
-          <w:p>
-            <w:pPr>
-              <w:pStyle w:val="Compact"/>
-              <w:jc w:val="left"/>
-            </w:pPr>
-            <w:r>
-              <w:t xml:space="preserve">The loop bound only:</w:t>
-            </w:r>
-            <w:r>
-              <w:t xml:space="preserve"> </w:t>
-            </w:r>
-            <w:r>
-              <w:rPr>
-                <w:rStyle w:val="VerbatimChar"/>
-              </w:rPr>
-              <w:t xml:space="preserve">LENGTH</w:t>
-            </w:r>
-            <w:r>
-              <w:t xml:space="preserve"> </w:t>
-            </w:r>
-            <w:r>
-              <w:t xml:space="preserve">was checked with the header. No: wait for the next payload byte.</w:t>
-            </w:r>
-          </w:p>
-        </w:tc>
-        <w:tc>
-          <w:tcPr/>
-          <w:p>
-            <w:pPr>
-              <w:pStyle w:val="Compact"/>
-              <w:jc w:val="left"/>
-            </w:pPr>
-            <w:r>
-              <w:t xml:space="preserve">–</w:t>
+              <w:t xml:space="preserve">CRC32 = PAY_CRC?</w:t>
+            </w:r>
+          </w:p>
+        </w:tc>
+        <w:tc>
+          <w:tcPr/>
+          <w:p>
+            <w:pPr>
+              <w:pStyle w:val="Compact"/>
+              <w:jc w:val="left"/>
+            </w:pPr>
+            <w:r>
+              <w:rPr>
+                <w:rStyle w:val="VerbatimChar"/>
+              </w:rPr>
+              <w:t xml:space="preserve">PAY_CRC</w:t>
+            </w:r>
+            <w:r>
+              <w:t xml:space="preserve"> </w:t>
+            </w:r>
+            <w:r>
+              <w:t xml:space="preserve">is the CRC32 the PC computed over the payload; the ROM compares it with its own.</w:t>
+            </w:r>
+          </w:p>
+        </w:tc>
+        <w:tc>
+          <w:tcPr/>
+          <w:p>
+            <w:pPr>
+              <w:pStyle w:val="Compact"/>
+              <w:jc w:val="left"/>
+            </w:pPr>
+            <w:r>
+              <w:t xml:space="preserve">no:</w:t>
+            </w:r>
+            <w:r>
+              <w:t xml:space="preserve"> </w:t>
+            </w:r>
+            <w:r>
+              <w:rPr>
+                <w:rStyle w:val="VerbatimChar"/>
+              </w:rPr>
+              <w:t xml:space="preserve">FPCR</w:t>
+            </w:r>
+            <w:r>
+              <w:t xml:space="preserve">, no jump</w:t>
             </w:r>
           </w:p>
         </w:tc>
@@ -5666,52 +6060,31 @@
               <w:jc w:val="left"/>
             </w:pPr>
             <w:r>
-              <w:t xml:space="preserve">CRC32 = PAY_CRC?</w:t>
-            </w:r>
-          </w:p>
-        </w:tc>
-        <w:tc>
-          <w:tcPr/>
-          <w:p>
-            <w:pPr>
-              <w:pStyle w:val="Compact"/>
-              <w:jc w:val="left"/>
-            </w:pPr>
-            <w:r>
-              <w:rPr>
-                <w:rStyle w:val="VerbatimChar"/>
-              </w:rPr>
-              <w:t xml:space="preserve">PAY_CRC</w:t>
-            </w:r>
-            <w:r>
-              <w:t xml:space="preserve"> </w:t>
-            </w:r>
-            <w:r>
-              <w:t xml:space="preserve">is the CRC32 the PC computed over the payload; the ROM compares it with its own.</w:t>
-            </w:r>
-          </w:p>
-        </w:tc>
-        <w:tc>
-          <w:tcPr/>
-          <w:p>
-            <w:pPr>
-              <w:pStyle w:val="Compact"/>
-              <w:jc w:val="left"/>
-            </w:pPr>
-            <w:r>
-              <w:t xml:space="preserve">no:</w:t>
-            </w:r>
-            <w:r>
-              <w:t xml:space="preserve"> </w:t>
-            </w:r>
-            <w:r>
-              <w:rPr>
-                <w:rStyle w:val="VerbatimChar"/>
-              </w:rPr>
-              <w:t xml:space="preserve">FPCR</w:t>
-            </w:r>
-            <w:r>
-              <w:t xml:space="preserve">, no jump</w:t>
+              <w:t xml:space="preserve">send ACKP, jump to 0x2000_1080 (ISRAM)</w:t>
+            </w:r>
+          </w:p>
+        </w:tc>
+        <w:tc>
+          <w:tcPr/>
+          <w:p>
+            <w:pPr>
+              <w:pStyle w:val="Compact"/>
+              <w:jc w:val="left"/>
+            </w:pPr>
+            <w:r>
+              <w:t xml:space="preserve">7.5.</w:t>
+            </w:r>
+          </w:p>
+        </w:tc>
+        <w:tc>
+          <w:tcPr/>
+          <w:p>
+            <w:pPr>
+              <w:pStyle w:val="Compact"/>
+              <w:jc w:val="left"/>
+            </w:pPr>
+            <w:r>
+              <w:t xml:space="preserve">–</w:t>
             </w:r>
           </w:p>
         </w:tc>
@@ -5725,45 +6098,7 @@
               <w:jc w:val="left"/>
             </w:pPr>
             <w:r>
-              <w:t xml:space="preserve">send ACKP, jump to ENTRY</w:t>
-            </w:r>
-          </w:p>
-        </w:tc>
-        <w:tc>
-          <w:tcPr/>
-          <w:p>
-            <w:pPr>
-              <w:pStyle w:val="Compact"/>
-              <w:jc w:val="left"/>
-            </w:pPr>
-            <w:r>
-              <w:t xml:space="preserve">7.5.</w:t>
-            </w:r>
-          </w:p>
-        </w:tc>
-        <w:tc>
-          <w:tcPr/>
-          <w:p>
-            <w:pPr>
-              <w:pStyle w:val="Compact"/>
-              <w:jc w:val="left"/>
-            </w:pPr>
-            <w:r>
-              <w:t xml:space="preserve">–</w:t>
-            </w:r>
-          </w:p>
-        </w:tc>
-      </w:tr>
-      <w:tr>
-        <w:tc>
-          <w:tcPr/>
-          <w:p>
-            <w:pPr>
-              <w:pStyle w:val="Compact"/>
-              <w:jc w:val="left"/>
-            </w:pPr>
-            <w:r>
-              <w:t xml:space="preserve">send failure token, clear RX FIFO, discard bytes until quiet for DRAIN_IDLE, send QRDY</w:t>
+              <w:t xml:space="preserve">send failure token, clear RX FIFO, discard bytes until quiet for DRAIN_IDLE polls, send QRDY</w:t>
             </w:r>
           </w:p>
         </w:tc>
@@ -6018,7 +6353,22 @@
               <w:t xml:space="preserve"> </w:t>
             </w:r>
             <w:r>
-              <w:t xml:space="preserve">correct, every field in range</w:t>
+              <w:t xml:space="preserve">correct,</w:t>
+            </w:r>
+            <w:r>
+              <w:t xml:space="preserve"> </w:t>
+            </w:r>
+            <w:r>
+              <w:rPr>
+                <w:rStyle w:val="VerbatimChar"/>
+              </w:rPr>
+              <w:t xml:space="preserve">LENGTH</w:t>
+            </w:r>
+            <w:r>
+              <w:t xml:space="preserve"> </w:t>
+            </w:r>
+            <w:r>
+              <w:t xml:space="preserve">in range</w:t>
             </w:r>
           </w:p>
         </w:tc>
@@ -6129,33 +6479,6 @@
               <w:t xml:space="preserve">LENGTH</w:t>
             </w:r>
             <w:r>
-              <w:t xml:space="preserve">,</w:t>
-            </w:r>
-            <w:r>
-              <w:t xml:space="preserve"> </w:t>
-            </w:r>
-            <w:r>
-              <w:rPr>
-                <w:rStyle w:val="VerbatimChar"/>
-              </w:rPr>
-              <w:t xml:space="preserve">LOAD_ADDR</w:t>
-            </w:r>
-            <w:r>
-              <w:t xml:space="preserve"> </w:t>
-            </w:r>
-            <w:r>
-              <w:t xml:space="preserve">or</w:t>
-            </w:r>
-            <w:r>
-              <w:t xml:space="preserve"> </w:t>
-            </w:r>
-            <w:r>
-              <w:rPr>
-                <w:rStyle w:val="VerbatimChar"/>
-              </w:rPr>
-              <w:t xml:space="preserve">ENTRY</w:t>
-            </w:r>
-            <w:r>
               <w:t xml:space="preserve"> </w:t>
             </w:r>
             <w:r>
@@ -6242,53 +6565,6 @@
             </w:r>
             <w:r>
               <w:t xml:space="preserve">between two bytes after</w:t>
-            </w:r>
-            <w:r>
-              <w:t xml:space="preserve"> </w:t>
-            </w:r>
-            <w:r>
-              <w:rPr>
-                <w:rStyle w:val="VerbatimChar"/>
-              </w:rPr>
-              <w:t xml:space="preserve">MAGIC</w:t>
-            </w:r>
-          </w:p>
-        </w:tc>
-      </w:tr>
-      <w:tr>
-        <w:tc>
-          <w:tcPr/>
-          <w:p>
-            <w:pPr>
-              <w:pStyle w:val="Compact"/>
-              <w:jc w:val="left"/>
-            </w:pPr>
-            <w:r>
-              <w:rPr>
-                <w:rStyle w:val="VerbatimChar"/>
-              </w:rPr>
-              <w:t xml:space="preserve">FUAR</w:t>
-            </w:r>
-          </w:p>
-        </w:tc>
-        <w:tc>
-          <w:tcPr/>
-          <w:p>
-            <w:pPr>
-              <w:pStyle w:val="Compact"/>
-              <w:jc w:val="left"/>
-            </w:pPr>
-            <w:r>
-              <w:rPr>
-                <w:rStyle w:val="VerbatimChar"/>
-              </w:rPr>
-              <w:t xml:space="preserve">LSR</w:t>
-            </w:r>
-            <w:r>
-              <w:t xml:space="preserve"> </w:t>
-            </w:r>
-            <w:r>
-              <w:t xml:space="preserve">overrun, parity or framing error, after</w:t>
             </w:r>
             <w:r>
               <w:t xml:space="preserve"> </w:t>
@@ -6341,13 +6617,7 @@
         <w:t xml:space="preserve"> </w:t>
       </w:r>
       <w:r>
-        <w:t xml:space="preserve">get no reply, UART errors included, so line noise is</w:t>
-      </w:r>
-      <w:r>
-        <w:t xml:space="preserve"> </w:t>
-      </w:r>
-      <w:r>
-        <w:t xml:space="preserve">harmless. No token is sent after reset: the PC sends its frame without waiting.</w:t>
+        <w:t xml:space="preserve">get no reply, so line noise is harmless. No token is sent after reset: the PC sends its frame without waiting.</w:t>
       </w:r>
       <w:r>
         <w:t xml:space="preserve"> </w:t>
@@ -6439,6 +6709,34 @@
       </w:r>
       <w:r>
         <w:t xml:space="preserve">.</w:t>
+      </w:r>
+    </w:p>
+    <w:p>
+      <w:pPr>
+        <w:numPr>
+          <w:ilvl w:val="0"/>
+          <w:numId w:val="1002"/>
+        </w:numPr>
+        <w:pStyle w:val="Compact"/>
+        <w:jc w:val="left"/>
+      </w:pPr>
+      <w:r>
+        <w:t xml:space="preserve">No token reports a UART error: a CRC failure or</w:t>
+      </w:r>
+      <w:r>
+        <w:t xml:space="preserve"> </w:t>
+      </w:r>
+      <w:r>
+        <w:rPr>
+          <w:rStyle w:val="VerbatimChar"/>
+        </w:rPr>
+        <w:t xml:space="preserve">FTMO</w:t>
+      </w:r>
+      <w:r>
+        <w:t xml:space="preserve"> </w:t>
+      </w:r>
+      <w:r>
+        <w:t xml:space="preserve">reports it (5).</w:t>
       </w:r>
     </w:p>
     <w:bookmarkEnd w:id="43"/>
@@ -7035,7 +7333,7 @@
         <w:rPr>
           <w:rStyle w:val="VerbatimChar"/>
         </w:rPr>
-        <w:t xml:space="preserve">ENTRY</w:t>
+        <w:t xml:space="preserve">0x2000_1080</w:t>
       </w:r>
       <w:r>
         <w:t xml:space="preserve">. It does not return.</w:t>
@@ -7735,58 +8033,16 @@
               <w:jc w:val="left"/>
             </w:pPr>
             <w:r>
-              <w:t xml:space="preserve">Packs an application binary into a frame;</w:t>
-            </w:r>
-            <w:r>
-              <w:t xml:space="preserve"> </w:t>
-            </w:r>
-            <w:r>
-              <w:rPr>
-                <w:rStyle w:val="VerbatimChar"/>
-              </w:rPr>
-              <w:t xml:space="preserve">--load</w:t>
-            </w:r>
-            <w:r>
-              <w:t xml:space="preserve"> </w:t>
-            </w:r>
-            <w:r>
-              <w:t xml:space="preserve">default</w:t>
-            </w:r>
-            <w:r>
-              <w:t xml:space="preserve"> </w:t>
-            </w:r>
-            <w:r>
-              <w:rPr>
-                <w:rStyle w:val="VerbatimChar"/>
-              </w:rPr>
-              <w:t xml:space="preserve">0x2000_1000</w:t>
-            </w:r>
-            <w:r>
-              <w:t xml:space="preserve">,</w:t>
-            </w:r>
-            <w:r>
-              <w:t xml:space="preserve"> </w:t>
-            </w:r>
-            <w:r>
-              <w:rPr>
-                <w:rStyle w:val="VerbatimChar"/>
-              </w:rPr>
-              <w:t xml:space="preserve">--entry</w:t>
-            </w:r>
-            <w:r>
-              <w:t xml:space="preserve"> </w:t>
-            </w:r>
-            <w:r>
-              <w:t xml:space="preserve">default load +</w:t>
-            </w:r>
-            <w:r>
-              <w:t xml:space="preserve"> </w:t>
-            </w:r>
-            <w:r>
-              <w:rPr>
-                <w:rStyle w:val="VerbatimChar"/>
-              </w:rPr>
-              <w:t xml:space="preserve">0x80</w:t>
+              <w:t xml:space="preserve">Packs an application binary into a frame: pads it to a multiple of 4 and sets</w:t>
+            </w:r>
+            <w:r>
+              <w:t xml:space="preserve"> </w:t>
+            </w:r>
+            <w:r>
+              <w:rPr>
+                <w:rStyle w:val="VerbatimChar"/>
+              </w:rPr>
+              <w:t xml:space="preserve">LENGTH</w:t>
             </w:r>
           </w:p>
         </w:tc>
@@ -7974,25 +8230,10 @@
         <w:rPr>
           <w:rStyle w:val="VerbatimChar"/>
         </w:rPr>
-        <w:t xml:space="preserve">LOAD_ADDR</w:t>
-      </w:r>
-      <w:r>
-        <w:t xml:space="preserve"> </w:t>
-      </w:r>
-      <w:r>
-        <w:t xml:space="preserve">&gt;=</w:t>
-      </w:r>
-      <w:r>
-        <w:t xml:space="preserve"> </w:t>
-      </w:r>
-      <w:r>
-        <w:rPr>
-          <w:rStyle w:val="VerbatimChar"/>
-        </w:rPr>
         <w:t xml:space="preserve">0x2000_1000</w:t>
       </w:r>
       <w:r>
-        <w:t xml:space="preserve">.</w:t>
+        <w:t xml:space="preserve">, 132 bytes to 60 KiB.</w:t>
       </w:r>
     </w:p>
     <w:p>
@@ -8014,7 +8255,7 @@
         <w:rPr>
           <w:rStyle w:val="VerbatimChar"/>
         </w:rPr>
-        <w:t xml:space="preserve">LOAD_ADDR</w:t>
+        <w:t xml:space="preserve">0x2000_1000</w:t>
       </w:r>
       <w:r>
         <w:t xml:space="preserve"> </w:t>
@@ -8059,55 +8300,10 @@
         <w:rPr>
           <w:rStyle w:val="VerbatimChar"/>
         </w:rPr>
-        <w:t xml:space="preserve">LOAD_ADDR</w:t>
-      </w:r>
-      <w:r>
-        <w:t xml:space="preserve"> </w:t>
-      </w:r>
-      <w:r>
-        <w:t xml:space="preserve">+</w:t>
-      </w:r>
-      <w:r>
-        <w:t xml:space="preserve"> </w:t>
-      </w:r>
-      <w:r>
-        <w:rPr>
-          <w:rStyle w:val="VerbatimChar"/>
-        </w:rPr>
-        <w:t xml:space="preserve">0x80</w:t>
-      </w:r>
-      <w:r>
-        <w:t xml:space="preserve">, so</w:t>
-      </w:r>
-      <w:r>
-        <w:t xml:space="preserve"> </w:t>
-      </w:r>
-      <w:r>
-        <w:rPr>
-          <w:rStyle w:val="VerbatimChar"/>
-        </w:rPr>
-        <w:t xml:space="preserve">ENTRY</w:t>
-      </w:r>
-      <w:r>
-        <w:t xml:space="preserve"> </w:t>
-      </w:r>
-      <w:r>
-        <w:t xml:space="preserve">=</w:t>
-      </w:r>
-      <w:r>
-        <w:t xml:space="preserve"> </w:t>
-      </w:r>
-      <w:r>
-        <w:rPr>
-          <w:rStyle w:val="VerbatimChar"/>
-        </w:rPr>
         <w:t xml:space="preserve">0x2000_1080</w:t>
       </w:r>
       <w:r>
-        <w:t xml:space="preserve"> </w:t>
-      </w:r>
-      <w:r>
-        <w:t xml:space="preserve">by default.</w:t>
+        <w:t xml:space="preserve">. The same image then runs in debug boot.</w:t>
       </w:r>
     </w:p>
     <w:p>
@@ -8509,7 +8705,7 @@
         <w:rPr>
           <w:rStyle w:val="VerbatimChar"/>
         </w:rPr>
-        <w:t xml:space="preserve">ENTRY</w:t>
+        <w:t xml:space="preserve">0x2000_1080</w:t>
       </w:r>
       <w:r>
         <w:t xml:space="preserve">.</w:t>
@@ -8546,7 +8742,10 @@
         <w:t xml:space="preserve">MAGIC</w:t>
       </w:r>
       <w:r>
-        <w:t xml:space="preserve">, UART errors included, get no reply.</w:t>
+        <w:t xml:space="preserve"> </w:t>
+      </w:r>
+      <w:r>
+        <w:t xml:space="preserve">get no reply.</w:t>
       </w:r>
     </w:p>
     <w:p>
@@ -8595,7 +8794,22 @@
         <w:t xml:space="preserve">FHCR</w:t>
       </w:r>
       <w:r>
-        <w:t xml:space="preserve">, a field out of range gives</w:t>
+        <w:t xml:space="preserve">, a</w:t>
+      </w:r>
+      <w:r>
+        <w:t xml:space="preserve"> </w:t>
+      </w:r>
+      <w:r>
+        <w:rPr>
+          <w:rStyle w:val="VerbatimChar"/>
+        </w:rPr>
+        <w:t xml:space="preserve">LENGTH</w:t>
+      </w:r>
+      <w:r>
+        <w:t xml:space="preserve"> </w:t>
+      </w:r>
+      <w:r>
+        <w:t xml:space="preserve">out of range gives</w:t>
       </w:r>
       <w:r>
         <w:t xml:space="preserve"> </w:t>
@@ -8741,13 +8955,13 @@
         <w:t xml:space="preserve">FTMO</w:t>
       </w:r>
       <w:r>
-        <w:t xml:space="preserve">; a UART error</w:t>
-      </w:r>
-      <w:r>
-        <w:t xml:space="preserve"> </w:t>
-      </w:r>
-      <w:r>
-        <w:t xml:space="preserve">gives</w:t>
+        <w:t xml:space="preserve">; a byte</w:t>
+      </w:r>
+      <w:r>
+        <w:t xml:space="preserve"> </w:t>
+      </w:r>
+      <w:r>
+        <w:t xml:space="preserve">changed on the line gives</w:t>
       </w:r>
       <w:r>
         <w:t xml:space="preserve"> </w:t>
@@ -8756,7 +8970,34 @@
         <w:rPr>
           <w:rStyle w:val="VerbatimChar"/>
         </w:rPr>
-        <w:t xml:space="preserve">FUAR</w:t>
+        <w:t xml:space="preserve">FHCR</w:t>
+      </w:r>
+      <w:r>
+        <w:t xml:space="preserve"> </w:t>
+      </w:r>
+      <w:r>
+        <w:t xml:space="preserve">or</w:t>
+      </w:r>
+      <w:r>
+        <w:t xml:space="preserve"> </w:t>
+      </w:r>
+      <w:r>
+        <w:rPr>
+          <w:rStyle w:val="VerbatimChar"/>
+        </w:rPr>
+        <w:t xml:space="preserve">FPCR</w:t>
+      </w:r>
+      <w:r>
+        <w:t xml:space="preserve">, a byte lost gives</w:t>
+      </w:r>
+      <w:r>
+        <w:t xml:space="preserve"> </w:t>
+      </w:r>
+      <w:r>
+        <w:rPr>
+          <w:rStyle w:val="VerbatimChar"/>
+        </w:rPr>
+        <w:t xml:space="preserve">FTMO</w:t>
       </w:r>
       <w:r>
         <w:t xml:space="preserve">.</w:t>
@@ -8854,7 +9095,7 @@
         <w:rPr>
           <w:rStyle w:val="VerbatimChar"/>
         </w:rPr>
-        <w:t xml:space="preserve">LOAD_ADDR</w:t>
+        <w:t xml:space="preserve">0x2000_1000</w:t>
       </w:r>
       <w:r>
         <w:t xml:space="preserve"> </w:t>
@@ -9324,7 +9565,7 @@
               <w:jc w:val="left"/>
             </w:pPr>
             <w:r>
-              <w:t xml:space="preserve">DECISIONS</w:t>
+              <w:t xml:space="preserve">DECISIONS; both removed in V3.2</w:t>
             </w:r>
           </w:p>
         </w:tc>
@@ -9772,7 +10013,7 @@
               <w:jc w:val="left"/>
             </w:pPr>
             <w:r>
-              <w:t xml:space="preserve">Figure 4-1: CRC pass?</w:t>
+              <w:t xml:space="preserve">Figure 7-1: CRC32 = PAY_CRC? before ACKP; V3.2 Figure 4-1 no longer repeats it</w:t>
             </w:r>
           </w:p>
         </w:tc>
@@ -9925,6 +10166,92 @@
             </w:pPr>
             <w:r>
               <w:t xml:space="preserve">Tables 4-2, 7-1</w:t>
+            </w:r>
+          </w:p>
+        </w:tc>
+      </w:tr>
+      <w:tr>
+        <w:tc>
+          <w:tcPr/>
+          <w:p>
+            <w:pPr>
+              <w:pStyle w:val="Compact"/>
+              <w:jc w:val="left"/>
+            </w:pPr>
+            <w:r>
+              <w:t xml:space="preserve">Drop</w:t>
+            </w:r>
+            <w:r>
+              <w:t xml:space="preserve"> </w:t>
+            </w:r>
+            <w:r>
+              <w:rPr>
+                <w:rStyle w:val="VerbatimChar"/>
+              </w:rPr>
+              <w:t xml:space="preserve">ENTRY</w:t>
+            </w:r>
+            <w:r>
+              <w:t xml:space="preserve"> </w:t>
+            </w:r>
+            <w:r>
+              <w:t xml:space="preserve">from the header, to match debug boot</w:t>
+            </w:r>
+          </w:p>
+        </w:tc>
+        <w:tc>
+          <w:tcPr/>
+          <w:p>
+            <w:pPr>
+              <w:pStyle w:val="Compact"/>
+              <w:jc w:val="left"/>
+            </w:pPr>
+            <w:r>
+              <w:t xml:space="preserve">Quan (mentor), V3.1 review</w:t>
+            </w:r>
+          </w:p>
+        </w:tc>
+        <w:tc>
+          <w:tcPr/>
+          <w:p>
+            <w:pPr>
+              <w:pStyle w:val="Compact"/>
+              <w:jc w:val="left"/>
+            </w:pPr>
+            <w:r>
+              <w:t xml:space="preserve">6: no</w:t>
+            </w:r>
+            <w:r>
+              <w:t xml:space="preserve"> </w:t>
+            </w:r>
+            <w:r>
+              <w:rPr>
+                <w:rStyle w:val="VerbatimChar"/>
+              </w:rPr>
+              <w:t xml:space="preserve">ENTRY</w:t>
+            </w:r>
+            <w:r>
+              <w:t xml:space="preserve">, no</w:t>
+            </w:r>
+            <w:r>
+              <w:t xml:space="preserve"> </w:t>
+            </w:r>
+            <w:r>
+              <w:rPr>
+                <w:rStyle w:val="VerbatimChar"/>
+              </w:rPr>
+              <w:t xml:space="preserve">LOAD_ADDR</w:t>
+            </w:r>
+            <w:r>
+              <w:t xml:space="preserve">; the ROM jumps to</w:t>
+            </w:r>
+            <w:r>
+              <w:t xml:space="preserve"> </w:t>
+            </w:r>
+            <w:r>
+              <w:rPr>
+                <w:rStyle w:val="VerbatimChar"/>
+              </w:rPr>
+              <w:t xml:space="preserve">0x2000_1080</w:t>
             </w:r>
           </w:p>
         </w:tc>
@@ -10169,7 +10496,7 @@
       <w:rPr>
         <w:szCs w:val="26"/>
       </w:rPr>
-      <w:t>V3.1</w:t>
+      <w:t>V3.2</w:t>
     </w:r>
     <w:r>
       <w:rPr>

</xml_diff>

<commit_message>
docs(boot): QNSC_BOOT_SPEC V3.4, DEBUG_PROG other than 0x55 is not checked
The mentor's feedback of 14/10, after which the boot flow is final.

- Table 6-1: DEBUG_PROG is not checked; 0x0000_0055 brings a debug
  program, any other value none (the loader sends 0x0000_00AA).
- Table 7-1, Table 7-2, 7.5, BOOT_003 and BOOT_012 follow: FHDR is for
  LENGTH only; Appendix B gains the 14/10 item.
- Figure 7-1: "LENGTH valid?" and a plain "no" on the bypass.
- QNSC_BOOT_DECISIONS: new section 1, V3.3 to V3.4; later sections
  renumbered.

Co-Authored-By: Claude Opus 5.5 (1M context) <noreply@anthropic.com>
</commit_message>
<xml_diff>
--- a/doc/specs/docx/QNSC_BOOT_SPEC.docx
+++ b/doc/specs/docx/QNSC_BOOT_SPEC.docx
@@ -39,7 +39,7 @@
         <w:t xml:space="preserve"> </w:t>
       </w:r>
       <w:r>
-        <w:t xml:space="preserve">V3.3</w:t>
+        <w:t xml:space="preserve">V3.4</w:t>
       </w:r>
     </w:p>
     <w:p>
@@ -435,6 +435,143 @@
               <w:jc w:val="left"/>
             </w:pPr>
             <w:r>
+              <w:t xml:space="preserve">V3.4</w:t>
+            </w:r>
+          </w:p>
+        </w:tc>
+        <w:tc>
+          <w:tcPr/>
+          <w:p>
+            <w:pPr>
+              <w:pStyle w:val="Compact"/>
+              <w:jc w:val="left"/>
+            </w:pPr>
+            <w:r>
+              <w:t xml:space="preserve">2026-10-14</w:t>
+            </w:r>
+          </w:p>
+        </w:tc>
+        <w:tc>
+          <w:tcPr/>
+          <w:p>
+            <w:pPr>
+              <w:pStyle w:val="Compact"/>
+              <w:jc w:val="left"/>
+            </w:pPr>
+            <w:r>
+              <w:t xml:space="preserve">Nguyen Hao Nam</w:t>
+            </w:r>
+          </w:p>
+        </w:tc>
+        <w:tc>
+          <w:tcPr/>
+          <w:p>
+            <w:pPr>
+              <w:pStyle w:val="Compact"/>
+              <w:jc w:val="left"/>
+            </w:pPr>
+            <w:r>
+              <w:t xml:space="preserve">–</w:t>
+            </w:r>
+          </w:p>
+        </w:tc>
+        <w:tc>
+          <w:tcPr/>
+          <w:p>
+            <w:pPr>
+              <w:pStyle w:val="Compact"/>
+              <w:jc w:val="left"/>
+            </w:pPr>
+            <w:r>
+              <w:t xml:space="preserve">Mentor feedback of 14/10 (Appendix B): the ROM loads the debug program when</w:t>
+            </w:r>
+            <w:r>
+              <w:t xml:space="preserve"> </w:t>
+            </w:r>
+            <w:r>
+              <w:rPr>
+                <w:rStyle w:val="VerbatimChar"/>
+              </w:rPr>
+              <w:t xml:space="preserve">DEBUG_PROG</w:t>
+            </w:r>
+            <w:r>
+              <w:t xml:space="preserve"> </w:t>
+            </w:r>
+            <w:r>
+              <w:t xml:space="preserve">is</w:t>
+            </w:r>
+            <w:r>
+              <w:t xml:space="preserve"> </w:t>
+            </w:r>
+            <w:r>
+              <w:rPr>
+                <w:rStyle w:val="VerbatimChar"/>
+              </w:rPr>
+              <w:t xml:space="preserve">0x0000_0055</w:t>
+            </w:r>
+            <w:r>
+              <w:t xml:space="preserve"> </w:t>
+            </w:r>
+            <w:r>
+              <w:t xml:space="preserve">and skips it for any other value;</w:t>
+            </w:r>
+            <w:r>
+              <w:t xml:space="preserve"> </w:t>
+            </w:r>
+            <w:r>
+              <w:rPr>
+                <w:rStyle w:val="VerbatimChar"/>
+              </w:rPr>
+              <w:t xml:space="preserve">0xAA</w:t>
+            </w:r>
+            <w:r>
+              <w:t xml:space="preserve"> </w:t>
+            </w:r>
+            <w:r>
+              <w:t xml:space="preserve">is no longer checked, so</w:t>
+            </w:r>
+            <w:r>
+              <w:t xml:space="preserve"> </w:t>
+            </w:r>
+            <w:r>
+              <w:rPr>
+                <w:rStyle w:val="VerbatimChar"/>
+              </w:rPr>
+              <w:t xml:space="preserve">FHDR</w:t>
+            </w:r>
+            <w:r>
+              <w:t xml:space="preserve"> </w:t>
+            </w:r>
+            <w:r>
+              <w:t xml:space="preserve">is for</w:t>
+            </w:r>
+            <w:r>
+              <w:t xml:space="preserve"> </w:t>
+            </w:r>
+            <w:r>
+              <w:rPr>
+                <w:rStyle w:val="VerbatimChar"/>
+              </w:rPr>
+              <w:t xml:space="preserve">LENGTH</w:t>
+            </w:r>
+            <w:r>
+              <w:t xml:space="preserve"> </w:t>
+            </w:r>
+            <w:r>
+              <w:t xml:space="preserve">only; Figures 6-1 and 7-1, Tables 6-1, 7-1, 7-2 and 11 with them</w:t>
+            </w:r>
+          </w:p>
+        </w:tc>
+      </w:tr>
+      <w:tr>
+        <w:tc>
+          <w:tcPr/>
+          <w:p>
+            <w:pPr>
+              <w:pStyle w:val="Compact"/>
+              <w:jc w:val="left"/>
+            </w:pPr>
+            <w:r>
               <w:t xml:space="preserve">V3.3</w:t>
             </w:r>
           </w:p>
@@ -3513,18 +3650,6 @@
               <w:t xml:space="preserve">LENGTH</w:t>
             </w:r>
             <w:r>
-              <w:t xml:space="preserve">,</w:t>
-            </w:r>
-            <w:r>
-              <w:t xml:space="preserve"> </w:t>
-            </w:r>
-            <w:r>
-              <w:rPr>
-                <w:rStyle w:val="VerbatimChar"/>
-              </w:rPr>
-              <w:t xml:space="preserve">DEBUG_PROG</w:t>
-            </w:r>
-            <w:r>
               <w:t xml:space="preserve">, the debug program CRC if there is one, and the payload CRC all pass. On any failure the ROM sends a failure token, empties the line and sends</w:t>
             </w:r>
             <w:r>
@@ -3790,16 +3915,16 @@
               <w:t xml:space="preserve"> </w:t>
             </w:r>
             <w:r>
-              <w:t xml:space="preserve">=</w:t>
-            </w:r>
-            <w:r>
-              <w:t xml:space="preserve"> </w:t>
-            </w:r>
-            <w:r>
-              <w:rPr>
-                <w:rStyle w:val="VerbatimChar"/>
-              </w:rPr>
-              <w:t xml:space="preserve">0xAA</w:t>
+              <w:t xml:space="preserve">other than</w:t>
+            </w:r>
+            <w:r>
+              <w:t xml:space="preserve"> </w:t>
+            </w:r>
+            <w:r>
+              <w:rPr>
+                <w:rStyle w:val="VerbatimChar"/>
+              </w:rPr>
+              <w:t xml:space="preserve">0x55</w:t>
             </w:r>
             <w:r>
               <w:t xml:space="preserve"> </w:t>
@@ -5021,25 +5146,19 @@
               <w:jc w:val="left"/>
             </w:pPr>
             <w:r>
+              <w:t xml:space="preserve">not checked:</w:t>
+            </w:r>
+            <w:r>
+              <w:t xml:space="preserve"> </w:t>
+            </w:r>
+            <w:r>
               <w:rPr>
                 <w:rStyle w:val="VerbatimChar"/>
               </w:rPr>
               <w:t xml:space="preserve">0x0000_0055</w:t>
             </w:r>
             <w:r>
-              <w:t xml:space="preserve">: a debug program follows the header;</w:t>
-            </w:r>
-            <w:r>
-              <w:t xml:space="preserve"> </w:t>
-            </w:r>
-            <w:r>
-              <w:rPr>
-                <w:rStyle w:val="VerbatimChar"/>
-              </w:rPr>
-              <w:t xml:space="preserve">0x0000_00AA</w:t>
-            </w:r>
-            <w:r>
-              <w:t xml:space="preserve">: none</w:t>
+              <w:t xml:space="preserve">, a debug program follows the header; any other value, none</w:t>
             </w:r>
           </w:p>
         </w:tc>
@@ -5614,25 +5733,70 @@
         <w:t xml:space="preserve"> </w:t>
       </w:r>
       <w:r>
-        <w:t xml:space="preserve">is a whole word so that every field stays on a 4-byte boundary. Any</w:t>
-      </w:r>
-      <w:r>
-        <w:t xml:space="preserve"> </w:t>
-      </w:r>
-      <w:r>
-        <w:t xml:space="preserve">other value than the two above is refused with</w:t>
-      </w:r>
-      <w:r>
-        <w:t xml:space="preserve"> </w:t>
-      </w:r>
-      <w:r>
-        <w:rPr>
-          <w:rStyle w:val="VerbatimChar"/>
-        </w:rPr>
-        <w:t xml:space="preserve">FHDR</w:t>
-      </w:r>
-      <w:r>
-        <w:t xml:space="preserve">.</w:t>
+        <w:t xml:space="preserve">is a whole word so that every field stays on a 4-byte boundary. The</w:t>
+      </w:r>
+      <w:r>
+        <w:t xml:space="preserve"> </w:t>
+      </w:r>
+      <w:r>
+        <w:t xml:space="preserve">ROM compares the whole word with</w:t>
+      </w:r>
+      <w:r>
+        <w:t xml:space="preserve"> </w:t>
+      </w:r>
+      <w:r>
+        <w:rPr>
+          <w:rStyle w:val="VerbatimChar"/>
+        </w:rPr>
+        <w:t xml:space="preserve">0x0000_0055</w:t>
+      </w:r>
+      <w:r>
+        <w:t xml:space="preserve"> </w:t>
+      </w:r>
+      <w:r>
+        <w:t xml:space="preserve">and checks nothing else: any other</w:t>
+      </w:r>
+      <w:r>
+        <w:t xml:space="preserve"> </w:t>
+      </w:r>
+      <w:r>
+        <w:t xml:space="preserve">value means no debug program, and the PC loader sends</w:t>
+      </w:r>
+      <w:r>
+        <w:t xml:space="preserve"> </w:t>
+      </w:r>
+      <w:r>
+        <w:rPr>
+          <w:rStyle w:val="VerbatimChar"/>
+        </w:rPr>
+        <w:t xml:space="preserve">0x0000_00AA</w:t>
+      </w:r>
+      <w:r>
+        <w:t xml:space="preserve"> </w:t>
+      </w:r>
+      <w:r>
+        <w:t xml:space="preserve">for that.</w:t>
+      </w:r>
+      <w:r>
+        <w:t xml:space="preserve"> </w:t>
+      </w:r>
+      <w:r>
+        <w:rPr>
+          <w:rStyle w:val="VerbatimChar"/>
+        </w:rPr>
+        <w:t xml:space="preserve">HDR_CRC</w:t>
+      </w:r>
+      <w:r>
+        <w:t xml:space="preserve"> </w:t>
+      </w:r>
+      <w:r>
+        <w:t xml:space="preserve">already shows that the value is the one the PC sent, and the PC sends the</w:t>
+      </w:r>
+      <w:r>
+        <w:t xml:space="preserve"> </w:t>
+      </w:r>
+      <w:r>
+        <w:t xml:space="preserve">debug program on the same test, so the two sides cannot disagree.</w:t>
       </w:r>
     </w:p>
     <w:p>
@@ -6245,19 +6409,19 @@
               <w:jc w:val="left"/>
             </w:pPr>
             <w:r>
-              <w:t xml:space="preserve">LENGTH and DEBUG_PROG valid?</w:t>
-            </w:r>
-          </w:p>
-        </w:tc>
-        <w:tc>
-          <w:tcPr/>
-          <w:p>
-            <w:pPr>
-              <w:pStyle w:val="Compact"/>
-              <w:jc w:val="left"/>
-            </w:pPr>
-            <w:r>
-              <w:t xml:space="preserve">The CRC only shows that the bytes arrived as the PC sent them, not that the values make sense.</w:t>
+              <w:t xml:space="preserve">LENGTH valid?</w:t>
+            </w:r>
+          </w:p>
+        </w:tc>
+        <w:tc>
+          <w:tcPr/>
+          <w:p>
+            <w:pPr>
+              <w:pStyle w:val="Compact"/>
+              <w:jc w:val="left"/>
+            </w:pPr>
+            <w:r>
+              <w:t xml:space="preserve">The CRC only shows that the bytes arrived as the PC sent them, not that the value makes sense.</w:t>
             </w:r>
             <w:r>
               <w:t xml:space="preserve"> </w:t>
@@ -6299,7 +6463,7 @@
               <w:t xml:space="preserve">ISRAM</w:t>
             </w:r>
             <w:r>
-              <w:t xml:space="preserve">;</w:t>
+              <w:t xml:space="preserve">.</w:t>
             </w:r>
             <w:r>
               <w:t xml:space="preserve"> </w:t>
@@ -6314,34 +6478,7 @@
               <w:t xml:space="preserve"> </w:t>
             </w:r>
             <w:r>
-              <w:t xml:space="preserve">must be</w:t>
-            </w:r>
-            <w:r>
-              <w:t xml:space="preserve"> </w:t>
-            </w:r>
-            <w:r>
-              <w:rPr>
-                <w:rStyle w:val="VerbatimChar"/>
-              </w:rPr>
-              <w:t xml:space="preserve">0x55</w:t>
-            </w:r>
-            <w:r>
-              <w:t xml:space="preserve"> </w:t>
-            </w:r>
-            <w:r>
-              <w:t xml:space="preserve">or</w:t>
-            </w:r>
-            <w:r>
-              <w:t xml:space="preserve"> </w:t>
-            </w:r>
-            <w:r>
-              <w:rPr>
-                <w:rStyle w:val="VerbatimChar"/>
-              </w:rPr>
-              <w:t xml:space="preserve">0xAA</w:t>
-            </w:r>
-            <w:r>
-              <w:t xml:space="preserve">.</w:t>
+              <w:t xml:space="preserve">is not checked.</w:t>
             </w:r>
           </w:p>
         </w:tc>
@@ -6435,7 +6572,7 @@
               <w:jc w:val="left"/>
             </w:pPr>
             <w:r>
-              <w:t xml:space="preserve">No: go to the payload.</w:t>
+              <w:t xml:space="preserve">The whole word is compared. No, any other value: go to the payload.</w:t>
             </w:r>
           </w:p>
         </w:tc>
@@ -7322,22 +7459,7 @@
               <w:t xml:space="preserve"> </w:t>
             </w:r>
             <w:r>
-              <w:t xml:space="preserve">in range,</w:t>
-            </w:r>
-            <w:r>
-              <w:t xml:space="preserve"> </w:t>
-            </w:r>
-            <w:r>
-              <w:rPr>
-                <w:rStyle w:val="VerbatimChar"/>
-              </w:rPr>
-              <w:t xml:space="preserve">DEBUG_PROG</w:t>
-            </w:r>
-            <w:r>
-              <w:t xml:space="preserve"> </w:t>
-            </w:r>
-            <w:r>
-              <w:t xml:space="preserve">valid</w:t>
+              <w:t xml:space="preserve">in range</w:t>
             </w:r>
           </w:p>
         </w:tc>
@@ -7513,46 +7635,7 @@
               <w:t xml:space="preserve"> </w:t>
             </w:r>
             <w:r>
-              <w:t xml:space="preserve">out of range, or</w:t>
-            </w:r>
-            <w:r>
-              <w:t xml:space="preserve"> </w:t>
-            </w:r>
-            <w:r>
-              <w:rPr>
-                <w:rStyle w:val="VerbatimChar"/>
-              </w:rPr>
-              <w:t xml:space="preserve">DEBUG_PROG</w:t>
-            </w:r>
-            <w:r>
-              <w:t xml:space="preserve"> </w:t>
-            </w:r>
-            <w:r>
-              <w:t xml:space="preserve">neither</w:t>
-            </w:r>
-            <w:r>
-              <w:t xml:space="preserve"> </w:t>
-            </w:r>
-            <w:r>
-              <w:rPr>
-                <w:rStyle w:val="VerbatimChar"/>
-              </w:rPr>
-              <w:t xml:space="preserve">0x55</w:t>
-            </w:r>
-            <w:r>
-              <w:t xml:space="preserve"> </w:t>
-            </w:r>
-            <w:r>
-              <w:t xml:space="preserve">nor</w:t>
-            </w:r>
-            <w:r>
-              <w:t xml:space="preserve"> </w:t>
-            </w:r>
-            <w:r>
-              <w:rPr>
-                <w:rStyle w:val="VerbatimChar"/>
-              </w:rPr>
-              <w:t xml:space="preserve">0xAA</w:t>
+              <w:t xml:space="preserve">out of range</w:t>
             </w:r>
           </w:p>
         </w:tc>
@@ -8955,16 +9038,16 @@
         <w:t xml:space="preserve"> </w:t>
       </w:r>
       <w:r>
-        <w:t xml:space="preserve">=</w:t>
-      </w:r>
-      <w:r>
-        <w:t xml:space="preserve"> </w:t>
-      </w:r>
-      <w:r>
-        <w:rPr>
-          <w:rStyle w:val="VerbatimChar"/>
-        </w:rPr>
-        <w:t xml:space="preserve">0xAA</w:t>
+        <w:t xml:space="preserve">other than</w:t>
+      </w:r>
+      <w:r>
+        <w:t xml:space="preserve"> </w:t>
+      </w:r>
+      <w:r>
+        <w:rPr>
+          <w:rStyle w:val="VerbatimChar"/>
+        </w:rPr>
+        <w:t xml:space="preserve">0x55</w:t>
       </w:r>
       <w:r>
         <w:t xml:space="preserve"> </w:t>
@@ -9478,7 +9561,7 @@
         <w:jc w:val="left"/>
       </w:pPr>
       <w:r>
-        <w:t xml:space="preserve">V3.3 image: 748 bytes, 620 bytes of code after the vector table.</w:t>
+        <w:t xml:space="preserve">V3.4 image: 734 bytes, 606 bytes of code after the vector table.</w:t>
       </w:r>
     </w:p>
     <w:p>
@@ -11415,7 +11498,37 @@
         <w:t xml:space="preserve"> </w:t>
       </w:r>
       <w:r>
-        <w:t xml:space="preserve">out of range or a</w:t>
+        <w:t xml:space="preserve">out of range gives</w:t>
+      </w:r>
+      <w:r>
+        <w:t xml:space="preserve"> </w:t>
+      </w:r>
+      <w:r>
+        <w:rPr>
+          <w:rStyle w:val="VerbatimChar"/>
+        </w:rPr>
+        <w:t xml:space="preserve">FHDR</w:t>
+      </w:r>
+      <w:r>
+        <w:t xml:space="preserve">;</w:t>
+      </w:r>
+      <w:r>
+        <w:t xml:space="preserve"> </w:t>
+      </w:r>
+      <w:r>
+        <w:t xml:space="preserve">neither writes</w:t>
+      </w:r>
+      <w:r>
+        <w:t xml:space="preserve"> </w:t>
+      </w:r>
+      <w:r>
+        <w:rPr>
+          <w:rStyle w:val="VerbatimChar"/>
+        </w:rPr>
+        <w:t xml:space="preserve">ISRAM</w:t>
+      </w:r>
+      <w:r>
+        <w:t xml:space="preserve">. A</w:t>
       </w:r>
       <w:r>
         <w:t xml:space="preserve"> </w:t>
@@ -11439,49 +11552,79 @@
         <w:rPr>
           <w:rStyle w:val="VerbatimChar"/>
         </w:rPr>
-        <w:t xml:space="preserve">0x55</w:t>
-      </w:r>
-      <w:r>
-        <w:t xml:space="preserve"> </w:t>
-      </w:r>
-      <w:r>
-        <w:t xml:space="preserve">and</w:t>
-      </w:r>
-      <w:r>
-        <w:t xml:space="preserve"> </w:t>
-      </w:r>
-      <w:r>
-        <w:rPr>
-          <w:rStyle w:val="VerbatimChar"/>
-        </w:rPr>
-        <w:t xml:space="preserve">0xAA</w:t>
-      </w:r>
-      <w:r>
-        <w:t xml:space="preserve"> </w:t>
-      </w:r>
-      <w:r>
-        <w:t xml:space="preserve">gives</w:t>
-      </w:r>
-      <w:r>
-        <w:t xml:space="preserve"> </w:t>
-      </w:r>
-      <w:r>
-        <w:rPr>
-          <w:rStyle w:val="VerbatimChar"/>
-        </w:rPr>
-        <w:t xml:space="preserve">FHDR</w:t>
-      </w:r>
-      <w:r>
-        <w:t xml:space="preserve">; none writes</w:t>
-      </w:r>
-      <w:r>
-        <w:t xml:space="preserve"> </w:t>
-      </w:r>
-      <w:r>
-        <w:rPr>
-          <w:rStyle w:val="VerbatimChar"/>
-        </w:rPr>
-        <w:t xml:space="preserve">ISRAM</w:t>
+        <w:t xml:space="preserve">0x0000_0055</w:t>
+      </w:r>
+      <w:r>
+        <w:t xml:space="preserve"> </w:t>
+      </w:r>
+      <w:r>
+        <w:t xml:space="preserve">(</w:t>
+      </w:r>
+      <w:r>
+        <w:rPr>
+          <w:rStyle w:val="VerbatimChar"/>
+        </w:rPr>
+        <w:t xml:space="preserve">0x0</w:t>
+      </w:r>
+      <w:r>
+        <w:t xml:space="preserve">,</w:t>
+      </w:r>
+      <w:r>
+        <w:t xml:space="preserve"> </w:t>
+      </w:r>
+      <w:r>
+        <w:rPr>
+          <w:rStyle w:val="VerbatimChar"/>
+        </w:rPr>
+        <w:t xml:space="preserve">0x33</w:t>
+      </w:r>
+      <w:r>
+        <w:t xml:space="preserve">,</w:t>
+      </w:r>
+      <w:r>
+        <w:t xml:space="preserve"> </w:t>
+      </w:r>
+      <w:r>
+        <w:rPr>
+          <w:rStyle w:val="VerbatimChar"/>
+        </w:rPr>
+        <w:t xml:space="preserve">0x155</w:t>
+      </w:r>
+      <w:r>
+        <w:t xml:space="preserve">) is taken as no debug program:</w:t>
+      </w:r>
+      <w:r>
+        <w:t xml:space="preserve"> </w:t>
+      </w:r>
+      <w:r>
+        <w:rPr>
+          <w:rStyle w:val="VerbatimChar"/>
+        </w:rPr>
+        <w:t xml:space="preserve">ACKH</w:t>
+      </w:r>
+      <w:r>
+        <w:t xml:space="preserve">,</w:t>
+      </w:r>
+      <w:r>
+        <w:t xml:space="preserve"> </w:t>
+      </w:r>
+      <w:r>
+        <w:rPr>
+          <w:rStyle w:val="VerbatimChar"/>
+        </w:rPr>
+        <w:t xml:space="preserve">ACKP</w:t>
+      </w:r>
+      <w:r>
+        <w:t xml:space="preserve">, nothing written below</w:t>
+      </w:r>
+      <w:r>
+        <w:t xml:space="preserve"> </w:t>
+      </w:r>
+      <w:r>
+        <w:rPr>
+          <w:rStyle w:val="VerbatimChar"/>
+        </w:rPr>
+        <w:t xml:space="preserve">0x2000_1000</w:t>
       </w:r>
       <w:r>
         <w:t xml:space="preserve">.</w:t>
@@ -12102,37 +12245,7 @@
         <w:t xml:space="preserve"> </w:t>
       </w:r>
       <w:r>
-        <w:t xml:space="preserve">pin at 1 and</w:t>
-      </w:r>
-      <w:r>
-        <w:t xml:space="preserve"> </w:t>
-      </w:r>
-      <w:r>
-        <w:rPr>
-          <w:rStyle w:val="VerbatimChar"/>
-        </w:rPr>
-        <w:t xml:space="preserve">DEBUG_PROG</w:t>
-      </w:r>
-      <w:r>
-        <w:t xml:space="preserve"> </w:t>
-      </w:r>
-      <w:r>
-        <w:t xml:space="preserve">=</w:t>
-      </w:r>
-      <w:r>
-        <w:t xml:space="preserve"> </w:t>
-      </w:r>
-      <w:r>
-        <w:rPr>
-          <w:rStyle w:val="VerbatimChar"/>
-        </w:rPr>
-        <w:t xml:space="preserve">0xAA</w:t>
-      </w:r>
-      <w:r>
-        <w:t xml:space="preserve"> </w:t>
-      </w:r>
-      <w:r>
-        <w:t xml:space="preserve">the ROM waits as</w:t>
+        <w:t xml:space="preserve">pin at 1 and no debug program the ROM waits as</w:t>
       </w:r>
       <w:r>
         <w:t xml:space="preserve"> </w:t>
@@ -13750,6 +13863,110 @@
             </w:r>
             <w:r>
               <w:t xml:space="preserve">7.5</w:t>
+            </w:r>
+          </w:p>
+        </w:tc>
+      </w:tr>
+      <w:tr>
+        <w:tc>
+          <w:tcPr/>
+          <w:p>
+            <w:pPr>
+              <w:pStyle w:val="Compact"/>
+              <w:jc w:val="left"/>
+            </w:pPr>
+            <w:r>
+              <w:rPr>
+                <w:rStyle w:val="VerbatimChar"/>
+              </w:rPr>
+              <w:t xml:space="preserve">DEBUG_PROG</w:t>
+            </w:r>
+            <w:r>
+              <w:t xml:space="preserve"> </w:t>
+            </w:r>
+            <w:r>
+              <w:t xml:space="preserve">=</w:t>
+            </w:r>
+            <w:r>
+              <w:t xml:space="preserve"> </w:t>
+            </w:r>
+            <w:r>
+              <w:rPr>
+                <w:rStyle w:val="VerbatimChar"/>
+              </w:rPr>
+              <w:t xml:space="preserve">0x55</w:t>
+            </w:r>
+            <w:r>
+              <w:t xml:space="preserve">: load the debug program; any other value: skip it, no</w:t>
+            </w:r>
+            <w:r>
+              <w:t xml:space="preserve"> </w:t>
+            </w:r>
+            <w:r>
+              <w:rPr>
+                <w:rStyle w:val="VerbatimChar"/>
+              </w:rPr>
+              <w:t xml:space="preserve">0xAA</w:t>
+            </w:r>
+            <w:r>
+              <w:t xml:space="preserve"> </w:t>
+            </w:r>
+            <w:r>
+              <w:t xml:space="preserve">check</w:t>
+            </w:r>
+          </w:p>
+        </w:tc>
+        <w:tc>
+          <w:tcPr/>
+          <w:p>
+            <w:pPr>
+              <w:pStyle w:val="Compact"/>
+              <w:jc w:val="left"/>
+            </w:pPr>
+            <w:r>
+              <w:t xml:space="preserve">Quan (mentor), 14/10</w:t>
+            </w:r>
+          </w:p>
+        </w:tc>
+        <w:tc>
+          <w:tcPr/>
+          <w:p>
+            <w:pPr>
+              <w:pStyle w:val="Compact"/>
+              <w:jc w:val="left"/>
+            </w:pPr>
+            <w:r>
+              <w:t xml:space="preserve">V3.4: 6, 7.1;</w:t>
+            </w:r>
+            <w:r>
+              <w:t xml:space="preserve"> </w:t>
+            </w:r>
+            <w:r>
+              <w:rPr>
+                <w:rStyle w:val="VerbatimChar"/>
+              </w:rPr>
+              <w:t xml:space="preserve">FHDR</w:t>
+            </w:r>
+            <w:r>
+              <w:t xml:space="preserve"> </w:t>
+            </w:r>
+            <w:r>
+              <w:t xml:space="preserve">for</w:t>
+            </w:r>
+            <w:r>
+              <w:t xml:space="preserve"> </w:t>
+            </w:r>
+            <w:r>
+              <w:rPr>
+                <w:rStyle w:val="VerbatimChar"/>
+              </w:rPr>
+              <w:t xml:space="preserve">LENGTH</w:t>
+            </w:r>
+            <w:r>
+              <w:t xml:space="preserve"> </w:t>
+            </w:r>
+            <w:r>
+              <w:t xml:space="preserve">only</w:t>
             </w:r>
           </w:p>
         </w:tc>
@@ -13994,7 +14211,7 @@
       <w:rPr>
         <w:szCs w:val="26"/>
       </w:rPr>
-      <w:t>V3.3</w:t>
+      <w:t>V3.4</w:t>
     </w:r>
     <w:r>
       <w:rPr>

</xml_diff>